<commit_message>
feat: highlight support for docx files
</commit_message>
<xml_diff>
--- a/examples/sample.docx
+++ b/examples/sample.docx
@@ -1218,7 +1218,17 @@
     </w:tbl>
     <w:p>
       <w:r>
-        <w:t xml:space="preserve">Start nearer the top of the table while you are learning; a firmer dough is far more forgiving on the bench.</w:t>
+        <w:t xml:space="preserve">Start nearer the top of the table while you are learning; </w:t>
+      </w:r>
+      <w:r>
+        <w:rPr>
+          <w:highlight w:val="yellow"/>
+          <w:highlightCs w:val="yellow"/>
+        </w:rPr>
+        <w:t xml:space="preserve">a firmer dough is far more forgiving</w:t>
+      </w:r>
+      <w:r>
+        <w:t xml:space="preserve"> on the bench.</w:t>
       </w:r>
     </w:p>
     <w:p>
@@ -1863,7 +1873,7 @@
       <w:r>
         <w:t xml:space="preserve">The </w:t>
       </w:r>
-      <w:hyperlink w:history="1" r:id="rId6gm3gxnapin5b7ejccpgz">
+      <w:hyperlink w:history="1" r:id="rIduk-s07ir7nmu8skm_aj5v">
         <w:r>
           <w:rPr>
             <w:color w:val="2563EB"/>
@@ -1887,7 +1897,7 @@
       <w:r>
         <w:t xml:space="preserve">King Arthur Baking's </w:t>
       </w:r>
-      <w:hyperlink w:history="1" r:id="rIdnmjv88xpz5kw0dfx8ibin">
+      <w:hyperlink w:history="1" r:id="rIdum2tnfj5cp8q8ydmauan1">
         <w:r>
           <w:rPr>
             <w:color w:val="2563EB"/>

</xml_diff>

<commit_message>
fix: multi-paragraph list items; expand sample to cover all supported features
</commit_message>
<xml_diff>
--- a/examples/sample.docx
+++ b/examples/sample.docx
@@ -284,6 +284,44 @@
                 <w:rStyle w:val="IndexLink"/>
               </w:rPr>
               <w:t xml:space="default">When Things Go Wrong</w:t>
+              <w:tab/>
+              <w:t xml:space="default"/>
+            </w:r>
+          </w:hyperlink>
+        </w:p>
+        <w:p>
+          <w:pPr>
+            <w:pStyle w:val="TOC2"/>
+            <w:tabs>
+              <w:tab w:val="clear" w:pos="8786"/>
+              <w:tab w:val="right" w:pos="9025" w:leader="dot"/>
+            </w:tabs>
+          </w:pPr>
+          <w:hyperlink w:history="1" w:anchor="_appendix_flour_in_depth">
+            <w:r>
+              <w:rPr>
+                <w:rStyle w:val="IndexLink"/>
+              </w:rPr>
+              <w:t xml:space="default">Appendix: Flour, in Depth</w:t>
+              <w:tab/>
+              <w:t xml:space="default"/>
+            </w:r>
+          </w:hyperlink>
+        </w:p>
+        <w:p>
+          <w:pPr>
+            <w:pStyle w:val="TOC3"/>
+            <w:tabs>
+              <w:tab w:val="clear" w:pos="8546"/>
+              <w:tab w:val="right" w:pos="9025" w:leader="dot"/>
+            </w:tabs>
+          </w:pPr>
+          <w:hyperlink w:history="1" w:anchor="_wheat_flours">
+            <w:r>
+              <w:rPr>
+                <w:rStyle w:val="IndexLink"/>
+              </w:rPr>
+              <w:t xml:space="default">Wheat Flours</w:t>
               <w:tab/>
               <w:t xml:space="default"/>
             </w:r>
@@ -684,6 +722,15 @@
     </w:p>
     <w:p>
       <w:pPr>
+        <w:spacing w:after="80"/>
+        <w:ind w:left="360"/>
+      </w:pPr>
+      <w:r>
+        <w:t xml:space="preserve">A starter is just flour and water kept alive by regular feeding. If you bake weekly, keep it in the fridge and refresh it the night before you mix.</w:t>
+      </w:r>
+    </w:p>
+    <w:p>
+      <w:pPr>
         <w:pStyle w:val="Heading3"/>
         <w:spacing w:after="120" w:before="240"/>
       </w:pPr>
@@ -797,7 +844,19 @@
     </w:p>
     <w:p>
       <w:r>
-        <w:t xml:space="preserve">The steps below assume a sourdough starter, but a teaspoon of instant yeast works too — just expect the timeline to shrink. Read the whole method once before you begin so nothing catches you by surprise.</w:t>
+        <w:t xml:space="preserve">The steps below assume a sourdough starter, but a teaspoon of instant yeast works too — just expect the timeline to shrink. Read the whole method once before you begin so nothing catches you by surprise — and if a loaf still disappoints, the </w:t>
+      </w:r>
+      <w:hyperlink w:history="1" w:anchor="_when_things_go_wrong">
+        <w:r>
+          <w:rPr>
+            <w:color w:val="2563EB"/>
+            <w:u w:val="single"/>
+          </w:rPr>
+          <w:t xml:space="preserve">troubleshooting table</w:t>
+        </w:r>
+      </w:hyperlink>
+      <w:r>
+        <w:t xml:space="preserve"> covers the usual suspects.</w:t>
       </w:r>
     </w:p>
     <w:p>
@@ -956,6 +1015,79 @@
           <w:iCs/>
         </w:rPr>
         <w:t xml:space="preserve">Tip: a cold overnight proof is optional but forgiving — it spreads the schedule across two days and deepens the flavor.</w:t>
+      </w:r>
+    </w:p>
+    <w:p>
+      <w:r>
+        <w:t xml:space="preserve">A typical weekend timeline looks like this:</w:t>
+      </w:r>
+    </w:p>
+    <w:p>
+      <w:r>
+        <w:t xml:space="preserve">Friday, 8 p.m. — feed the starter </w:t>
+      </w:r>
+      <w:r>
+        <w:br/>
+      </w:r>
+      <w:r>
+        <w:t xml:space="preserve">Saturday, 9 a.m. — mix, then start the folds </w:t>
+      </w:r>
+      <w:r>
+        <w:br/>
+      </w:r>
+      <w:r>
+        <w:t xml:space="preserve">Saturday, 6 p.m. — shape and chill overnight </w:t>
+      </w:r>
+      <w:r>
+        <w:br/>
+      </w:r>
+      <w:r>
+        <w:t xml:space="preserve">Sunday, 8 a.m. — bake and cool before slicing</w:t>
+      </w:r>
+    </w:p>
+    <w:p>
+      <w:r>
+        <w:t xml:space="preserve">Bake until the crust is a deep, even amber — roughly this shade: </w:t>
+      </w:r>
+      <w:r>
+        <w:drawing>
+          <wp:inline distT="0" distB="0" distL="0" distR="0">
+            <wp:extent cx="609600" cy="228600"/>
+            <wp:effectExtent t="0" r="0" b="0" l="0"/>
+            <wp:docPr id="1" name="Target deep-amber crust color" descr="Target deep-amber crust color" title="Target deep-amber crust color"/>
+            <wp:cNvGraphicFramePr>
+              <a:graphicFrameLocks xmlns:a="http://schemas.openxmlformats.org/drawingml/2006/main" noChangeAspect="1"/>
+            </wp:cNvGraphicFramePr>
+            <a:graphic xmlns:a="http://schemas.openxmlformats.org/drawingml/2006/main">
+              <a:graphicData uri="http://schemas.openxmlformats.org/drawingml/2006/picture">
+                <pic:pic xmlns:pic="http://schemas.openxmlformats.org/drawingml/2006/picture">
+                  <pic:nvPicPr>
+                    <pic:cNvPr id="0" name="" descr=""/>
+                    <pic:cNvPicPr>
+                      <a:picLocks noChangeAspect="1" noChangeArrowheads="1"/>
+                    </pic:cNvPicPr>
+                  </pic:nvPicPr>
+                  <pic:blipFill>
+                    <a:blip r:embed="rId8" cstate="none"/>
+                    <a:srcRect/>
+                    <a:stretch>
+                      <a:fillRect/>
+                    </a:stretch>
+                  </pic:blipFill>
+                  <pic:spPr bwMode="auto">
+                    <a:xfrm>
+                      <a:off x="0" y="0"/>
+                      <a:ext cx="609600" cy="228600"/>
+                    </a:xfrm>
+                    <a:prstGeom prst="rect">
+                      <a:avLst/>
+                    </a:prstGeom>
+                  </pic:spPr>
+                </pic:pic>
+              </a:graphicData>
+            </a:graphic>
+          </wp:inline>
+        </w:drawing>
       </w:r>
     </w:p>
     <w:p>
@@ -987,6 +1119,572 @@
       </w:r>
       <w:r>
         <w:t xml:space="preserve"> is the weight of water expressed as a percentage of the flour. It is the number that most changes how a dough feels and how open the final crumb is.</w:t>
+      </w:r>
+    </w:p>
+    <w:tbl>
+      <w:tblPr>
+        <w:tblW w:type="pct" w:w="100%"/>
+        <w:tblBorders>
+          <w:top w:val="single" w:color="auto" w:sz="4"/>
+          <w:left w:val="single" w:color="auto" w:sz="4"/>
+          <w:bottom w:val="single" w:color="auto" w:sz="4"/>
+          <w:right w:val="single" w:color="auto" w:sz="4"/>
+          <w:insideH w:val="single" w:color="auto" w:sz="4"/>
+          <w:insideV w:val="single" w:color="auto" w:sz="4"/>
+        </w:tblBorders>
+      </w:tblPr>
+      <w:tblGrid>
+        <w:gridCol w:w="100"/>
+        <w:gridCol w:w="100"/>
+        <w:gridCol w:w="100"/>
+      </w:tblGrid>
+      <w:tr>
+        <w:trPr>
+          <w:tblHeader/>
+        </w:trPr>
+        <w:tc>
+          <w:tcPr>
+            <w:shd w:fill="F3F4F6" w:color="auto" w:val="clear"/>
+          </w:tcPr>
+          <w:p>
+            <w:pPr>
+              <w:spacing w:after="40" w:before="40"/>
+              <w:jc w:val="right"/>
+            </w:pPr>
+            <w:r>
+              <w:rPr>
+                <w:b/>
+                <w:bCs/>
+              </w:rPr>
+              <w:t xml:space="preserve">Hydration</w:t>
+            </w:r>
+          </w:p>
+        </w:tc>
+        <w:tc>
+          <w:tcPr>
+            <w:shd w:fill="F3F4F6" w:color="auto" w:val="clear"/>
+          </w:tcPr>
+          <w:p>
+            <w:pPr>
+              <w:spacing w:after="40" w:before="40"/>
+              <w:jc w:val="center"/>
+            </w:pPr>
+            <w:r>
+              <w:rPr>
+                <w:b/>
+                <w:bCs/>
+              </w:rPr>
+              <w:t xml:space="preserve">Dough feel</w:t>
+            </w:r>
+          </w:p>
+        </w:tc>
+        <w:tc>
+          <w:tcPr>
+            <w:shd w:fill="F3F4F6" w:color="auto" w:val="clear"/>
+          </w:tcPr>
+          <w:p>
+            <w:pPr>
+              <w:spacing w:after="40" w:before="40"/>
+              <w:jc w:val="left"/>
+            </w:pPr>
+            <w:r>
+              <w:rPr>
+                <w:b/>
+                <w:bCs/>
+              </w:rPr>
+              <w:t xml:space="preserve">Best suited to</w:t>
+            </w:r>
+          </w:p>
+        </w:tc>
+      </w:tr>
+      <w:tr>
+        <w:trPr>
+          <w:tblHeader w:val="false"/>
+        </w:trPr>
+        <w:tc>
+          <w:p>
+            <w:pPr>
+              <w:spacing w:after="40" w:before="40"/>
+              <w:jc w:val="right"/>
+            </w:pPr>
+            <w:r>
+              <w:rPr>
+                <w:b w:val="false"/>
+                <w:bCs w:val="false"/>
+              </w:rPr>
+              <w:t xml:space="preserve">65%</w:t>
+            </w:r>
+          </w:p>
+        </w:tc>
+        <w:tc>
+          <w:p>
+            <w:pPr>
+              <w:spacing w:after="40" w:before="40"/>
+              <w:jc w:val="center"/>
+            </w:pPr>
+            <w:r>
+              <w:rPr>
+                <w:b w:val="false"/>
+                <w:bCs w:val="false"/>
+              </w:rPr>
+              <w:t xml:space="preserve">Firm, easy to shape</w:t>
+            </w:r>
+          </w:p>
+        </w:tc>
+        <w:tc>
+          <w:p>
+            <w:pPr>
+              <w:spacing w:after="40" w:before="40"/>
+              <w:jc w:val="left"/>
+            </w:pPr>
+            <w:r>
+              <w:rPr>
+                <w:b w:val="false"/>
+                <w:bCs w:val="false"/>
+              </w:rPr>
+              <w:t xml:space="preserve">Sandwich and beginner loaves</w:t>
+            </w:r>
+          </w:p>
+        </w:tc>
+      </w:tr>
+      <w:tr>
+        <w:trPr>
+          <w:tblHeader w:val="false"/>
+        </w:trPr>
+        <w:tc>
+          <w:p>
+            <w:pPr>
+              <w:spacing w:after="40" w:before="40"/>
+              <w:jc w:val="right"/>
+            </w:pPr>
+            <w:r>
+              <w:rPr>
+                <w:b w:val="false"/>
+                <w:bCs w:val="false"/>
+              </w:rPr>
+              <w:t xml:space="preserve">75%</w:t>
+            </w:r>
+          </w:p>
+        </w:tc>
+        <w:tc>
+          <w:p>
+            <w:pPr>
+              <w:spacing w:after="40" w:before="40"/>
+              <w:jc w:val="center"/>
+            </w:pPr>
+            <w:r>
+              <w:rPr>
+                <w:b w:val="false"/>
+                <w:bCs w:val="false"/>
+              </w:rPr>
+              <w:t xml:space="preserve">Soft but manageable</w:t>
+            </w:r>
+          </w:p>
+        </w:tc>
+        <w:tc>
+          <w:p>
+            <w:pPr>
+              <w:spacing w:after="40" w:before="40"/>
+              <w:jc w:val="left"/>
+            </w:pPr>
+            <w:r>
+              <w:rPr>
+                <w:b w:val="false"/>
+                <w:bCs w:val="false"/>
+              </w:rPr>
+              <w:t xml:space="preserve">Everyday country bread</w:t>
+            </w:r>
+          </w:p>
+        </w:tc>
+      </w:tr>
+      <w:tr>
+        <w:trPr>
+          <w:tblHeader w:val="false"/>
+        </w:trPr>
+        <w:tc>
+          <w:p>
+            <w:pPr>
+              <w:spacing w:after="40" w:before="40"/>
+              <w:jc w:val="right"/>
+            </w:pPr>
+            <w:r>
+              <w:rPr>
+                <w:b w:val="false"/>
+                <w:bCs w:val="false"/>
+              </w:rPr>
+              <w:t xml:space="preserve">85%</w:t>
+            </w:r>
+          </w:p>
+        </w:tc>
+        <w:tc>
+          <w:p>
+            <w:pPr>
+              <w:spacing w:after="40" w:before="40"/>
+              <w:jc w:val="center"/>
+            </w:pPr>
+            <w:r>
+              <w:rPr>
+                <w:b w:val="false"/>
+                <w:bCs w:val="false"/>
+              </w:rPr>
+              <w:t xml:space="preserve">Slack and sticky</w:t>
+            </w:r>
+          </w:p>
+        </w:tc>
+        <w:tc>
+          <w:p>
+            <w:pPr>
+              <w:spacing w:after="40" w:before="40"/>
+              <w:jc w:val="left"/>
+            </w:pPr>
+            <w:r>
+              <w:rPr>
+                <w:b w:val="false"/>
+                <w:bCs w:val="false"/>
+              </w:rPr>
+              <w:t xml:space="preserve">Open, rustic crumb</w:t>
+            </w:r>
+          </w:p>
+        </w:tc>
+      </w:tr>
+    </w:tbl>
+    <w:p>
+      <w:r>
+        <w:t xml:space="preserve">Start nearer the top of the table while you are learning; </w:t>
+      </w:r>
+      <w:r>
+        <w:rPr>
+          <w:highlight w:val="yellow"/>
+          <w:highlightCs w:val="yellow"/>
+        </w:rPr>
+        <w:t xml:space="preserve">a firmer dough is far more forgiving</w:t>
+      </w:r>
+      <w:r>
+        <w:t xml:space="preserve"> on the bench.</w:t>
+      </w:r>
+    </w:p>
+    <w:p>
+      <w:pPr>
+        <w:pStyle w:val="Heading2"/>
+        <w:spacing w:after="120" w:before="240"/>
+      </w:pPr>
+      <w:bookmarkStart w:name="_automating_the_baker_s_math" w:id="1"/>
+      <w:r>
+        <w:rPr>
+          <w:rFonts w:ascii="Calibri Light" w:cs="Calibri Light" w:eastAsia="Calibri Light" w:hAnsi="Calibri Light"/>
+          <w:b/>
+          <w:bCs/>
+          <w:color w:val="2F5496"/>
+          <w:sz w:val="36"/>
+          <w:szCs w:val="36"/>
+        </w:rPr>
+        <w:t xml:space="preserve">Automating the Baker's Math</w:t>
+      </w:r>
+      <w:bookmarkEnd w:id="1"/>
+    </w:p>
+    <w:p>
+      <w:r>
+        <w:t xml:space="preserve">Bakers describe recipes in </w:t>
+      </w:r>
+      <w:r>
+        <w:rPr>
+          <w:i/>
+          <w:iCs/>
+        </w:rPr>
+        <w:t xml:space="preserve">baker's percentages</w:t>
+      </w:r>
+      <w:r>
+        <w:t xml:space="preserve">, where every ingredient is measured relative to the flour. Once you know your target dough weight and hydration, the individual weights fall out with a little arithmetic. The helper below turns a target weight into gram amounts — note the </w:t>
+      </w:r>
+      <w:r>
+        <w:rPr>
+          <w:rFonts w:ascii="Consolas" w:cs="Consolas" w:eastAsia="Consolas" w:hAnsi="Consolas"/>
+          <w:sz w:val="20"/>
+          <w:szCs w:val="20"/>
+          <w:shd w:fill="F3F4F6" w:color="auto" w:val="clear"/>
+        </w:rPr>
+        <w:t xml:space="preserve">hydration</w:t>
+      </w:r>
+      <w:r>
+        <w:t xml:space="preserve"> and </w:t>
+      </w:r>
+      <w:r>
+        <w:rPr>
+          <w:rFonts w:ascii="Consolas" w:cs="Consolas" w:eastAsia="Consolas" w:hAnsi="Consolas"/>
+          <w:sz w:val="20"/>
+          <w:szCs w:val="20"/>
+          <w:shd w:fill="F3F4F6" w:color="auto" w:val="clear"/>
+        </w:rPr>
+        <w:t xml:space="preserve">salt_pct</w:t>
+      </w:r>
+      <w:r>
+        <w:t xml:space="preserve"> arguments are given as fractions.</w:t>
+      </w:r>
+    </w:p>
+    <w:p>
+      <w:pPr>
+        <w:shd w:fill="F3F4F6" w:color="auto" w:val="clear"/>
+        <w:spacing w:after="0" w:before="80"/>
+      </w:pPr>
+      <w:r>
+        <w:rPr>
+          <w:rFonts w:ascii="Consolas" w:cs="Consolas" w:eastAsia="Consolas" w:hAnsi="Consolas"/>
+          <w:sz w:val="20"/>
+          <w:szCs w:val="20"/>
+        </w:rPr>
+        <w:t xml:space="preserve">def bakers_math(total_grams: float, hydration: float, salt_pct: float) -&gt; dict:
+</w:t>
+      </w:r>
+    </w:p>
+    <w:p>
+      <w:pPr>
+        <w:shd w:fill="F3F4F6" w:color="auto" w:val="clear"/>
+        <w:spacing w:after="0" w:before="0"/>
+      </w:pPr>
+      <w:r>
+        <w:rPr>
+          <w:rFonts w:ascii="Consolas" w:cs="Consolas" w:eastAsia="Consolas" w:hAnsi="Consolas"/>
+          <w:sz w:val="20"/>
+          <w:szCs w:val="20"/>
+        </w:rPr>
+        <w:t xml:space="preserve">	"""Split a target dough weight into flour, water, and salt."""
+</w:t>
+      </w:r>
+    </w:p>
+    <w:p>
+      <w:pPr>
+        <w:shd w:fill="F3F4F6" w:color="auto" w:val="clear"/>
+        <w:spacing w:after="0" w:before="0"/>
+      </w:pPr>
+      <w:r>
+        <w:rPr>
+          <w:rFonts w:ascii="Consolas" w:cs="Consolas" w:eastAsia="Consolas" w:hAnsi="Consolas"/>
+          <w:sz w:val="20"/>
+          <w:szCs w:val="20"/>
+        </w:rPr>
+        <w:t xml:space="preserve">	# total = flour * (1 + hydration + salt_pct)
+</w:t>
+      </w:r>
+    </w:p>
+    <w:p>
+      <w:pPr>
+        <w:shd w:fill="F3F4F6" w:color="auto" w:val="clear"/>
+        <w:spacing w:after="0" w:before="0"/>
+      </w:pPr>
+      <w:r>
+        <w:rPr>
+          <w:rFonts w:ascii="Consolas" w:cs="Consolas" w:eastAsia="Consolas" w:hAnsi="Consolas"/>
+          <w:sz w:val="20"/>
+          <w:szCs w:val="20"/>
+        </w:rPr>
+        <w:t xml:space="preserve">	flour = total_grams / (1 + hydration + salt_pct)
+</w:t>
+      </w:r>
+    </w:p>
+    <w:p>
+      <w:pPr>
+        <w:shd w:fill="F3F4F6" w:color="auto" w:val="clear"/>
+        <w:spacing w:after="0" w:before="0"/>
+      </w:pPr>
+      <w:r>
+        <w:rPr>
+          <w:rFonts w:ascii="Consolas" w:cs="Consolas" w:eastAsia="Consolas" w:hAnsi="Consolas"/>
+          <w:sz w:val="20"/>
+          <w:szCs w:val="20"/>
+        </w:rPr>
+        <w:t xml:space="preserve">	return {
+</w:t>
+      </w:r>
+    </w:p>
+    <w:p>
+      <w:pPr>
+        <w:shd w:fill="F3F4F6" w:color="auto" w:val="clear"/>
+        <w:spacing w:after="0" w:before="0"/>
+      </w:pPr>
+      <w:r>
+        <w:rPr>
+          <w:rFonts w:ascii="Consolas" w:cs="Consolas" w:eastAsia="Consolas" w:hAnsi="Consolas"/>
+          <w:sz w:val="20"/>
+          <w:szCs w:val="20"/>
+        </w:rPr>
+        <w:t xml:space="preserve">		"flour": round(flour),
+</w:t>
+      </w:r>
+    </w:p>
+    <w:p>
+      <w:pPr>
+        <w:shd w:fill="F3F4F6" w:color="auto" w:val="clear"/>
+        <w:spacing w:after="0" w:before="0"/>
+      </w:pPr>
+      <w:r>
+        <w:rPr>
+          <w:rFonts w:ascii="Consolas" w:cs="Consolas" w:eastAsia="Consolas" w:hAnsi="Consolas"/>
+          <w:sz w:val="20"/>
+          <w:szCs w:val="20"/>
+        </w:rPr>
+        <w:t xml:space="preserve">		"water": round(flour * hydration),
+</w:t>
+      </w:r>
+    </w:p>
+    <w:p>
+      <w:pPr>
+        <w:shd w:fill="F3F4F6" w:color="auto" w:val="clear"/>
+        <w:spacing w:after="0" w:before="0"/>
+      </w:pPr>
+      <w:r>
+        <w:rPr>
+          <w:rFonts w:ascii="Consolas" w:cs="Consolas" w:eastAsia="Consolas" w:hAnsi="Consolas"/>
+          <w:sz w:val="20"/>
+          <w:szCs w:val="20"/>
+        </w:rPr>
+        <w:t xml:space="preserve">		"salt": round(flour * salt_pct),
+</w:t>
+      </w:r>
+    </w:p>
+    <w:p>
+      <w:pPr>
+        <w:shd w:fill="F3F4F6" w:color="auto" w:val="clear"/>
+        <w:spacing w:after="0" w:before="0"/>
+      </w:pPr>
+      <w:r>
+        <w:rPr>
+          <w:rFonts w:ascii="Consolas" w:cs="Consolas" w:eastAsia="Consolas" w:hAnsi="Consolas"/>
+          <w:sz w:val="20"/>
+          <w:szCs w:val="20"/>
+        </w:rPr>
+        <w:t xml:space="preserve">	}
+</w:t>
+      </w:r>
+    </w:p>
+    <w:p>
+      <w:pPr>
+        <w:shd w:fill="F3F4F6" w:color="auto" w:val="clear"/>
+        <w:spacing w:after="0" w:before="0"/>
+      </w:pPr>
+      <w:r>
+        <w:rPr>
+          <w:rFonts w:ascii="Consolas" w:cs="Consolas" w:eastAsia="Consolas" w:hAnsi="Consolas"/>
+          <w:sz w:val="20"/>
+          <w:szCs w:val="20"/>
+        </w:rPr>
+        <w:t xml:space="preserve">
+</w:t>
+      </w:r>
+    </w:p>
+    <w:p>
+      <w:pPr>
+        <w:shd w:fill="F3F4F6" w:color="auto" w:val="clear"/>
+        <w:spacing w:after="0" w:before="0"/>
+      </w:pPr>
+      <w:r>
+        <w:rPr>
+          <w:rFonts w:ascii="Consolas" w:cs="Consolas" w:eastAsia="Consolas" w:hAnsi="Consolas"/>
+          <w:sz w:val="20"/>
+          <w:szCs w:val="20"/>
+        </w:rPr>
+        <w:t xml:space="preserve">
+</w:t>
+      </w:r>
+    </w:p>
+    <w:p>
+      <w:pPr>
+        <w:shd w:fill="F3F4F6" w:color="auto" w:val="clear"/>
+        <w:spacing w:after="0" w:before="0"/>
+      </w:pPr>
+      <w:r>
+        <w:rPr>
+          <w:rFonts w:ascii="Consolas" w:cs="Consolas" w:eastAsia="Consolas" w:hAnsi="Consolas"/>
+          <w:sz w:val="20"/>
+          <w:szCs w:val="20"/>
+        </w:rPr>
+        <w:t xml:space="preserve">recipe = bakers_math(total_grams=900, hydration=0.75, salt_pct=0.02)
+</w:t>
+      </w:r>
+    </w:p>
+    <w:p>
+      <w:pPr>
+        <w:shd w:fill="F3F4F6" w:color="auto" w:val="clear"/>
+        <w:spacing w:after="160" w:before="0"/>
+      </w:pPr>
+      <w:r>
+        <w:rPr>
+          <w:rFonts w:ascii="Consolas" w:cs="Consolas" w:eastAsia="Consolas" w:hAnsi="Consolas"/>
+          <w:sz w:val="20"/>
+          <w:szCs w:val="20"/>
+        </w:rPr>
+        <w:t xml:space="preserve">print(recipe)  # -&gt; {'flour': 508, 'water': 381, 'salt': 10}</w:t>
+      </w:r>
+    </w:p>
+    <w:p>
+      <w:r>
+        <w:t xml:space="preserve">If you prefer to check the figures by hand, remember that flour is always the </w:t>
+      </w:r>
+      <w:r>
+        <w:rPr>
+          <w:rFonts w:ascii="Consolas" w:cs="Consolas" w:eastAsia="Consolas" w:hAnsi="Consolas"/>
+          <w:sz w:val="20"/>
+          <w:szCs w:val="20"/>
+          <w:shd w:fill="F3F4F6" w:color="auto" w:val="clear"/>
+        </w:rPr>
+        <w:t xml:space="preserve">100%</w:t>
+      </w:r>
+      <w:r>
+        <w:t xml:space="preserve"> baseline: a </w:t>
+      </w:r>
+      <w:r>
+        <w:rPr>
+          <w:rFonts w:ascii="Consolas" w:cs="Consolas" w:eastAsia="Consolas" w:hAnsi="Consolas"/>
+          <w:sz w:val="20"/>
+          <w:szCs w:val="20"/>
+          <w:shd w:fill="F3F4F6" w:color="auto" w:val="clear"/>
+        </w:rPr>
+        <w:t xml:space="preserve">75%</w:t>
+      </w:r>
+      <w:r>
+        <w:t xml:space="preserve"> hydration simply means the water weighs three-quarters of what the flour does. The same idea generalizes — you can express butter, seeds, or sugar as a percentage and scale a batch by any factor </w:t>
+      </w:r>
+      <w:r>
+        <w:rPr>
+          <w:i/>
+          <w:iCs/>
+        </w:rPr>
+        <w:t xml:space="preserve">k</w:t>
+      </w:r>
+      <w:r>
+        <w:t xml:space="preserve"> without touching the ratios. Scaling in three dimensions is less forgiving, though: double every side of a loaf and its volume grows as 2</w:t>
+      </w:r>
+      <w:r>
+        <w:rPr>
+          <w:vertAlign w:val="superscript"/>
+        </w:rPr>
+        <w:t xml:space="preserve">3</w:t>
+      </w:r>
+      <w:r>
+        <w:t xml:space="preserve"> — eight times the dough for the same shape, and a bake time that no longer lines up with the original recipe.</w:t>
+      </w:r>
+    </w:p>
+    <w:p>
+      <w:pPr>
+        <w:pStyle w:val="Heading2"/>
+        <w:spacing w:after="120" w:before="240"/>
+      </w:pPr>
+      <w:bookmarkStart w:name="_when_things_go_wrong" w:id="1"/>
+      <w:r>
+        <w:rPr>
+          <w:rFonts w:ascii="Calibri Light" w:cs="Calibri Light" w:eastAsia="Calibri Light" w:hAnsi="Calibri Light"/>
+          <w:b/>
+          <w:bCs/>
+          <w:color w:val="2F5496"/>
+          <w:sz w:val="36"/>
+          <w:szCs w:val="36"/>
+        </w:rPr>
+        <w:t xml:space="preserve">When Things Go Wrong</w:t>
+      </w:r>
+      <w:bookmarkEnd w:id="1"/>
+    </w:p>
+    <w:p>
+      <w:r>
+        <w:t xml:space="preserve">Most failures trace back to time, temperature, or gluten. This table maps the symptom you see to the cause worth checking first.</w:t>
       </w:r>
     </w:p>
     <w:tbl>
@@ -1024,7 +1722,7 @@
                 <w:b/>
                 <w:bCs/>
               </w:rPr>
-              <w:t xml:space="preserve">Hydration</w:t>
+              <w:t xml:space="preserve">Symptom</w:t>
             </w:r>
           </w:p>
         </w:tc>
@@ -1042,7 +1740,7 @@
                 <w:b/>
                 <w:bCs/>
               </w:rPr>
-              <w:t xml:space="preserve">Dough feel</w:t>
+              <w:t xml:space="preserve">Likely cause</w:t>
             </w:r>
           </w:p>
         </w:tc>
@@ -1060,7 +1758,7 @@
                 <w:b/>
                 <w:bCs/>
               </w:rPr>
-              <w:t xml:space="preserve">Best suited to</w:t>
+              <w:t xml:space="preserve">Fix</w:t>
             </w:r>
           </w:p>
         </w:tc>
@@ -1080,7 +1778,7 @@
                 <w:b w:val="false"/>
                 <w:bCs w:val="false"/>
               </w:rPr>
-              <w:t xml:space="preserve">65%</w:t>
+              <w:t xml:space="preserve">Dense, gummy crumb</w:t>
             </w:r>
           </w:p>
         </w:tc>
@@ -1095,7 +1793,7 @@
                 <w:b w:val="false"/>
                 <w:bCs w:val="false"/>
               </w:rPr>
-              <w:t xml:space="preserve">Firm, easy to shape</w:t>
+              <w:t xml:space="preserve">Under-fermented dough</w:t>
             </w:r>
           </w:p>
         </w:tc>
@@ -1110,7 +1808,7 @@
                 <w:b w:val="false"/>
                 <w:bCs w:val="false"/>
               </w:rPr>
-              <w:t xml:space="preserve">Sandwich and beginner loaves</w:t>
+              <w:t xml:space="preserve">Give the bulk rise more time</w:t>
             </w:r>
           </w:p>
         </w:tc>
@@ -1130,7 +1828,7 @@
                 <w:b w:val="false"/>
                 <w:bCs w:val="false"/>
               </w:rPr>
-              <w:t xml:space="preserve">75%</w:t>
+              <w:t xml:space="preserve">Flat, spreading loaf</w:t>
             </w:r>
           </w:p>
         </w:tc>
@@ -1145,7 +1843,7 @@
                 <w:b w:val="false"/>
                 <w:bCs w:val="false"/>
               </w:rPr>
-              <w:t xml:space="preserve">Soft but manageable</w:t>
+              <w:t xml:space="preserve">Over-proofed or weak gluten</w:t>
             </w:r>
           </w:p>
         </w:tc>
@@ -1160,7 +1858,7 @@
                 <w:b w:val="false"/>
                 <w:bCs w:val="false"/>
               </w:rPr>
-              <w:t xml:space="preserve">Everyday country bread</w:t>
+              <w:t xml:space="preserve">Shape tighter, proof less</w:t>
             </w:r>
           </w:p>
         </w:tc>
@@ -1180,7 +1878,7 @@
                 <w:b w:val="false"/>
                 <w:bCs w:val="false"/>
               </w:rPr>
-              <w:t xml:space="preserve">85%</w:t>
+              <w:t xml:space="preserve">Pale crust</w:t>
             </w:r>
           </w:p>
         </w:tc>
@@ -1195,7 +1893,7 @@
                 <w:b w:val="false"/>
                 <w:bCs w:val="false"/>
               </w:rPr>
-              <w:t xml:space="preserve">Slack and sticky</w:t>
+              <w:t xml:space="preserve">Oven too cool or no steam</w:t>
             </w:r>
           </w:p>
         </w:tc>
@@ -1210,423 +1908,7 @@
                 <w:b w:val="false"/>
                 <w:bCs w:val="false"/>
               </w:rPr>
-              <w:t xml:space="preserve">Open, rustic crumb</w:t>
-            </w:r>
-          </w:p>
-        </w:tc>
-      </w:tr>
-    </w:tbl>
-    <w:p>
-      <w:r>
-        <w:t xml:space="preserve">Start nearer the top of the table while you are learning; </w:t>
-      </w:r>
-      <w:r>
-        <w:rPr>
-          <w:highlight w:val="yellow"/>
-          <w:highlightCs w:val="yellow"/>
-        </w:rPr>
-        <w:t xml:space="preserve">a firmer dough is far more forgiving</w:t>
-      </w:r>
-      <w:r>
-        <w:t xml:space="preserve"> on the bench.</w:t>
-      </w:r>
-    </w:p>
-    <w:p>
-      <w:pPr>
-        <w:pStyle w:val="Heading2"/>
-        <w:spacing w:after="120" w:before="240"/>
-      </w:pPr>
-      <w:bookmarkStart w:name="_automating_the_baker_s_math" w:id="1"/>
-      <w:r>
-        <w:rPr>
-          <w:rFonts w:ascii="Calibri Light" w:cs="Calibri Light" w:eastAsia="Calibri Light" w:hAnsi="Calibri Light"/>
-          <w:b/>
-          <w:bCs/>
-          <w:color w:val="2F5496"/>
-          <w:sz w:val="36"/>
-          <w:szCs w:val="36"/>
-        </w:rPr>
-        <w:t xml:space="preserve">Automating the Baker's Math</w:t>
-      </w:r>
-      <w:bookmarkEnd w:id="1"/>
-    </w:p>
-    <w:p>
-      <w:r>
-        <w:t xml:space="preserve">Bakers describe recipes in </w:t>
-      </w:r>
-      <w:r>
-        <w:rPr>
-          <w:i/>
-          <w:iCs/>
-        </w:rPr>
-        <w:t xml:space="preserve">baker's percentages</w:t>
-      </w:r>
-      <w:r>
-        <w:t xml:space="preserve">, where every ingredient is measured relative to the flour. Once you know your target dough weight and hydration, the individual weights fall out with a little arithmetic. The helper below turns a target weight into gram amounts — note the </w:t>
-      </w:r>
-      <w:r>
-        <w:rPr>
-          <w:rFonts w:ascii="Consolas" w:cs="Consolas" w:eastAsia="Consolas" w:hAnsi="Consolas"/>
-          <w:sz w:val="20"/>
-          <w:szCs w:val="20"/>
-          <w:shd w:fill="F3F4F6" w:color="auto" w:val="clear"/>
-        </w:rPr>
-        <w:t xml:space="preserve">hydration</w:t>
-      </w:r>
-      <w:r>
-        <w:t xml:space="preserve"> and </w:t>
-      </w:r>
-      <w:r>
-        <w:rPr>
-          <w:rFonts w:ascii="Consolas" w:cs="Consolas" w:eastAsia="Consolas" w:hAnsi="Consolas"/>
-          <w:sz w:val="20"/>
-          <w:szCs w:val="20"/>
-          <w:shd w:fill="F3F4F6" w:color="auto" w:val="clear"/>
-        </w:rPr>
-        <w:t xml:space="preserve">salt_pct</w:t>
-      </w:r>
-      <w:r>
-        <w:t xml:space="preserve"> arguments are given as fractions.</w:t>
-      </w:r>
-    </w:p>
-    <w:p>
-      <w:pPr>
-        <w:shd w:fill="F3F4F6" w:color="auto" w:val="clear"/>
-        <w:spacing w:after="0" w:before="80"/>
-      </w:pPr>
-      <w:r>
-        <w:rPr>
-          <w:rFonts w:ascii="Consolas" w:cs="Consolas" w:eastAsia="Consolas" w:hAnsi="Consolas"/>
-          <w:sz w:val="20"/>
-          <w:szCs w:val="20"/>
-        </w:rPr>
-        <w:t xml:space="preserve">def bakers_math(total_grams: float, hydration: float, salt_pct: float) -&gt; dict:
-</w:t>
-      </w:r>
-    </w:p>
-    <w:p>
-      <w:pPr>
-        <w:shd w:fill="F3F4F6" w:color="auto" w:val="clear"/>
-        <w:spacing w:after="0" w:before="0"/>
-      </w:pPr>
-      <w:r>
-        <w:rPr>
-          <w:rFonts w:ascii="Consolas" w:cs="Consolas" w:eastAsia="Consolas" w:hAnsi="Consolas"/>
-          <w:sz w:val="20"/>
-          <w:szCs w:val="20"/>
-        </w:rPr>
-        <w:t xml:space="preserve">	"""Split a target dough weight into flour, water, and salt."""
-</w:t>
-      </w:r>
-    </w:p>
-    <w:p>
-      <w:pPr>
-        <w:shd w:fill="F3F4F6" w:color="auto" w:val="clear"/>
-        <w:spacing w:after="0" w:before="0"/>
-      </w:pPr>
-      <w:r>
-        <w:rPr>
-          <w:rFonts w:ascii="Consolas" w:cs="Consolas" w:eastAsia="Consolas" w:hAnsi="Consolas"/>
-          <w:sz w:val="20"/>
-          <w:szCs w:val="20"/>
-        </w:rPr>
-        <w:t xml:space="preserve">	# total = flour * (1 + hydration + salt_pct)
-</w:t>
-      </w:r>
-    </w:p>
-    <w:p>
-      <w:pPr>
-        <w:shd w:fill="F3F4F6" w:color="auto" w:val="clear"/>
-        <w:spacing w:after="0" w:before="0"/>
-      </w:pPr>
-      <w:r>
-        <w:rPr>
-          <w:rFonts w:ascii="Consolas" w:cs="Consolas" w:eastAsia="Consolas" w:hAnsi="Consolas"/>
-          <w:sz w:val="20"/>
-          <w:szCs w:val="20"/>
-        </w:rPr>
-        <w:t xml:space="preserve">	flour = total_grams / (1 + hydration + salt_pct)
-</w:t>
-      </w:r>
-    </w:p>
-    <w:p>
-      <w:pPr>
-        <w:shd w:fill="F3F4F6" w:color="auto" w:val="clear"/>
-        <w:spacing w:after="0" w:before="0"/>
-      </w:pPr>
-      <w:r>
-        <w:rPr>
-          <w:rFonts w:ascii="Consolas" w:cs="Consolas" w:eastAsia="Consolas" w:hAnsi="Consolas"/>
-          <w:sz w:val="20"/>
-          <w:szCs w:val="20"/>
-        </w:rPr>
-        <w:t xml:space="preserve">	return {
-</w:t>
-      </w:r>
-    </w:p>
-    <w:p>
-      <w:pPr>
-        <w:shd w:fill="F3F4F6" w:color="auto" w:val="clear"/>
-        <w:spacing w:after="0" w:before="0"/>
-      </w:pPr>
-      <w:r>
-        <w:rPr>
-          <w:rFonts w:ascii="Consolas" w:cs="Consolas" w:eastAsia="Consolas" w:hAnsi="Consolas"/>
-          <w:sz w:val="20"/>
-          <w:szCs w:val="20"/>
-        </w:rPr>
-        <w:t xml:space="preserve">		"flour": round(flour),
-</w:t>
-      </w:r>
-    </w:p>
-    <w:p>
-      <w:pPr>
-        <w:shd w:fill="F3F4F6" w:color="auto" w:val="clear"/>
-        <w:spacing w:after="0" w:before="0"/>
-      </w:pPr>
-      <w:r>
-        <w:rPr>
-          <w:rFonts w:ascii="Consolas" w:cs="Consolas" w:eastAsia="Consolas" w:hAnsi="Consolas"/>
-          <w:sz w:val="20"/>
-          <w:szCs w:val="20"/>
-        </w:rPr>
-        <w:t xml:space="preserve">		"water": round(flour * hydration),
-</w:t>
-      </w:r>
-    </w:p>
-    <w:p>
-      <w:pPr>
-        <w:shd w:fill="F3F4F6" w:color="auto" w:val="clear"/>
-        <w:spacing w:after="0" w:before="0"/>
-      </w:pPr>
-      <w:r>
-        <w:rPr>
-          <w:rFonts w:ascii="Consolas" w:cs="Consolas" w:eastAsia="Consolas" w:hAnsi="Consolas"/>
-          <w:sz w:val="20"/>
-          <w:szCs w:val="20"/>
-        </w:rPr>
-        <w:t xml:space="preserve">		"salt": round(flour * salt_pct),
-</w:t>
-      </w:r>
-    </w:p>
-    <w:p>
-      <w:pPr>
-        <w:shd w:fill="F3F4F6" w:color="auto" w:val="clear"/>
-        <w:spacing w:after="0" w:before="0"/>
-      </w:pPr>
-      <w:r>
-        <w:rPr>
-          <w:rFonts w:ascii="Consolas" w:cs="Consolas" w:eastAsia="Consolas" w:hAnsi="Consolas"/>
-          <w:sz w:val="20"/>
-          <w:szCs w:val="20"/>
-        </w:rPr>
-        <w:t xml:space="preserve">	}
-</w:t>
-      </w:r>
-    </w:p>
-    <w:p>
-      <w:pPr>
-        <w:shd w:fill="F3F4F6" w:color="auto" w:val="clear"/>
-        <w:spacing w:after="0" w:before="0"/>
-      </w:pPr>
-      <w:r>
-        <w:rPr>
-          <w:rFonts w:ascii="Consolas" w:cs="Consolas" w:eastAsia="Consolas" w:hAnsi="Consolas"/>
-          <w:sz w:val="20"/>
-          <w:szCs w:val="20"/>
-        </w:rPr>
-        <w:t xml:space="preserve">
-</w:t>
-      </w:r>
-    </w:p>
-    <w:p>
-      <w:pPr>
-        <w:shd w:fill="F3F4F6" w:color="auto" w:val="clear"/>
-        <w:spacing w:after="0" w:before="0"/>
-      </w:pPr>
-      <w:r>
-        <w:rPr>
-          <w:rFonts w:ascii="Consolas" w:cs="Consolas" w:eastAsia="Consolas" w:hAnsi="Consolas"/>
-          <w:sz w:val="20"/>
-          <w:szCs w:val="20"/>
-        </w:rPr>
-        <w:t xml:space="preserve">
-</w:t>
-      </w:r>
-    </w:p>
-    <w:p>
-      <w:pPr>
-        <w:shd w:fill="F3F4F6" w:color="auto" w:val="clear"/>
-        <w:spacing w:after="0" w:before="0"/>
-      </w:pPr>
-      <w:r>
-        <w:rPr>
-          <w:rFonts w:ascii="Consolas" w:cs="Consolas" w:eastAsia="Consolas" w:hAnsi="Consolas"/>
-          <w:sz w:val="20"/>
-          <w:szCs w:val="20"/>
-        </w:rPr>
-        <w:t xml:space="preserve">recipe = bakers_math(total_grams=900, hydration=0.75, salt_pct=0.02)
-</w:t>
-      </w:r>
-    </w:p>
-    <w:p>
-      <w:pPr>
-        <w:shd w:fill="F3F4F6" w:color="auto" w:val="clear"/>
-        <w:spacing w:after="160" w:before="0"/>
-      </w:pPr>
-      <w:r>
-        <w:rPr>
-          <w:rFonts w:ascii="Consolas" w:cs="Consolas" w:eastAsia="Consolas" w:hAnsi="Consolas"/>
-          <w:sz w:val="20"/>
-          <w:szCs w:val="20"/>
-        </w:rPr>
-        <w:t xml:space="preserve">print(recipe)  # -&gt; {'flour': 508, 'water': 381, 'salt': 10}</w:t>
-      </w:r>
-    </w:p>
-    <w:p>
-      <w:r>
-        <w:t xml:space="preserve">If you prefer to check the figures by hand, remember that flour is always the </w:t>
-      </w:r>
-      <w:r>
-        <w:rPr>
-          <w:rFonts w:ascii="Consolas" w:cs="Consolas" w:eastAsia="Consolas" w:hAnsi="Consolas"/>
-          <w:sz w:val="20"/>
-          <w:szCs w:val="20"/>
-          <w:shd w:fill="F3F4F6" w:color="auto" w:val="clear"/>
-        </w:rPr>
-        <w:t xml:space="preserve">100%</w:t>
-      </w:r>
-      <w:r>
-        <w:t xml:space="preserve"> baseline: a </w:t>
-      </w:r>
-      <w:r>
-        <w:rPr>
-          <w:rFonts w:ascii="Consolas" w:cs="Consolas" w:eastAsia="Consolas" w:hAnsi="Consolas"/>
-          <w:sz w:val="20"/>
-          <w:szCs w:val="20"/>
-          <w:shd w:fill="F3F4F6" w:color="auto" w:val="clear"/>
-        </w:rPr>
-        <w:t xml:space="preserve">75%</w:t>
-      </w:r>
-      <w:r>
-        <w:t xml:space="preserve"> hydration simply means the water weighs three-quarters of what the flour does. The same idea generalizes — you can express butter, seeds, or sugar as a percentage and scale a batch by any factor </w:t>
-      </w:r>
-      <w:r>
-        <w:rPr>
-          <w:i/>
-          <w:iCs/>
-        </w:rPr>
-        <w:t xml:space="preserve">k</w:t>
-      </w:r>
-      <w:r>
-        <w:t xml:space="preserve"> without touching the ratios. Scaling in three dimensions is less forgiving, though: double every side of a loaf and its volume grows as 2</w:t>
-      </w:r>
-      <w:r>
-        <w:rPr>
-          <w:vertAlign w:val="superscript"/>
-        </w:rPr>
-        <w:t xml:space="preserve">3</w:t>
-      </w:r>
-      <w:r>
-        <w:t xml:space="preserve"> — eight times the dough for the same shape, and a bake time that no longer lines up with the original recipe.</w:t>
-      </w:r>
-    </w:p>
-    <w:p>
-      <w:pPr>
-        <w:pStyle w:val="Heading2"/>
-        <w:spacing w:after="120" w:before="240"/>
-      </w:pPr>
-      <w:bookmarkStart w:name="_when_things_go_wrong" w:id="1"/>
-      <w:r>
-        <w:rPr>
-          <w:rFonts w:ascii="Calibri Light" w:cs="Calibri Light" w:eastAsia="Calibri Light" w:hAnsi="Calibri Light"/>
-          <w:b/>
-          <w:bCs/>
-          <w:color w:val="2F5496"/>
-          <w:sz w:val="36"/>
-          <w:szCs w:val="36"/>
-        </w:rPr>
-        <w:t xml:space="preserve">When Things Go Wrong</w:t>
-      </w:r>
-      <w:bookmarkEnd w:id="1"/>
-    </w:p>
-    <w:p>
-      <w:r>
-        <w:t xml:space="preserve">Most failures trace back to time, temperature, or gluten. This table maps the symptom you see to the cause worth checking first.</w:t>
-      </w:r>
-    </w:p>
-    <w:tbl>
-      <w:tblPr>
-        <w:tblW w:type="pct" w:w="100%"/>
-        <w:tblBorders>
-          <w:top w:val="single" w:color="auto" w:sz="4"/>
-          <w:left w:val="single" w:color="auto" w:sz="4"/>
-          <w:bottom w:val="single" w:color="auto" w:sz="4"/>
-          <w:right w:val="single" w:color="auto" w:sz="4"/>
-          <w:insideH w:val="single" w:color="auto" w:sz="4"/>
-          <w:insideV w:val="single" w:color="auto" w:sz="4"/>
-        </w:tblBorders>
-      </w:tblPr>
-      <w:tblGrid>
-        <w:gridCol w:w="100"/>
-        <w:gridCol w:w="100"/>
-        <w:gridCol w:w="100"/>
-      </w:tblGrid>
-      <w:tr>
-        <w:trPr>
-          <w:tblHeader/>
-        </w:trPr>
-        <w:tc>
-          <w:tcPr>
-            <w:shd w:fill="F3F4F6" w:color="auto" w:val="clear"/>
-          </w:tcPr>
-          <w:p>
-            <w:pPr>
-              <w:spacing w:after="40" w:before="40"/>
-              <w:jc w:val="left"/>
-            </w:pPr>
-            <w:r>
-              <w:rPr>
-                <w:b/>
-                <w:bCs/>
-              </w:rPr>
-              <w:t xml:space="preserve">Symptom</w:t>
-            </w:r>
-          </w:p>
-        </w:tc>
-        <w:tc>
-          <w:tcPr>
-            <w:shd w:fill="F3F4F6" w:color="auto" w:val="clear"/>
-          </w:tcPr>
-          <w:p>
-            <w:pPr>
-              <w:spacing w:after="40" w:before="40"/>
-              <w:jc w:val="left"/>
-            </w:pPr>
-            <w:r>
-              <w:rPr>
-                <w:b/>
-                <w:bCs/>
-              </w:rPr>
-              <w:t xml:space="preserve">Likely cause</w:t>
-            </w:r>
-          </w:p>
-        </w:tc>
-        <w:tc>
-          <w:tcPr>
-            <w:shd w:fill="F3F4F6" w:color="auto" w:val="clear"/>
-          </w:tcPr>
-          <w:p>
-            <w:pPr>
-              <w:spacing w:after="40" w:before="40"/>
-              <w:jc w:val="left"/>
-            </w:pPr>
-            <w:r>
-              <w:rPr>
-                <w:b/>
-                <w:bCs/>
-              </w:rPr>
-              <w:t xml:space="preserve">Fix</w:t>
+              <w:t xml:space="preserve">Raise heat; bake covered</w:t>
             </w:r>
           </w:p>
         </w:tc>
@@ -1645,8 +1927,9 @@
               <w:rPr>
                 <w:b w:val="false"/>
                 <w:bCs w:val="false"/>
-              </w:rPr>
-              <w:t xml:space="preserve">Dense, gummy crumb</w:t>
+                <w:strike/>
+              </w:rPr>
+              <w:t xml:space="preserve">Burnt bottom</w:t>
             </w:r>
           </w:p>
         </w:tc>
@@ -1661,7 +1944,7 @@
                 <w:b w:val="false"/>
                 <w:bCs w:val="false"/>
               </w:rPr>
-              <w:t xml:space="preserve">Under-fermented dough</w:t>
+              <w:t xml:space="preserve">Rack too low</w:t>
             </w:r>
           </w:p>
         </w:tc>
@@ -1676,157 +1959,6 @@
                 <w:b w:val="false"/>
                 <w:bCs w:val="false"/>
               </w:rPr>
-              <w:t xml:space="preserve">Give the bulk rise more time</w:t>
-            </w:r>
-          </w:p>
-        </w:tc>
-      </w:tr>
-      <w:tr>
-        <w:trPr>
-          <w:tblHeader w:val="false"/>
-        </w:trPr>
-        <w:tc>
-          <w:p>
-            <w:pPr>
-              <w:spacing w:after="40" w:before="40"/>
-              <w:jc w:val="left"/>
-            </w:pPr>
-            <w:r>
-              <w:rPr>
-                <w:b w:val="false"/>
-                <w:bCs w:val="false"/>
-              </w:rPr>
-              <w:t xml:space="preserve">Flat, spreading loaf</w:t>
-            </w:r>
-          </w:p>
-        </w:tc>
-        <w:tc>
-          <w:p>
-            <w:pPr>
-              <w:spacing w:after="40" w:before="40"/>
-              <w:jc w:val="left"/>
-            </w:pPr>
-            <w:r>
-              <w:rPr>
-                <w:b w:val="false"/>
-                <w:bCs w:val="false"/>
-              </w:rPr>
-              <w:t xml:space="preserve">Over-proofed or weak gluten</w:t>
-            </w:r>
-          </w:p>
-        </w:tc>
-        <w:tc>
-          <w:p>
-            <w:pPr>
-              <w:spacing w:after="40" w:before="40"/>
-              <w:jc w:val="left"/>
-            </w:pPr>
-            <w:r>
-              <w:rPr>
-                <w:b w:val="false"/>
-                <w:bCs w:val="false"/>
-              </w:rPr>
-              <w:t xml:space="preserve">Shape tighter, proof less</w:t>
-            </w:r>
-          </w:p>
-        </w:tc>
-      </w:tr>
-      <w:tr>
-        <w:trPr>
-          <w:tblHeader w:val="false"/>
-        </w:trPr>
-        <w:tc>
-          <w:p>
-            <w:pPr>
-              <w:spacing w:after="40" w:before="40"/>
-              <w:jc w:val="left"/>
-            </w:pPr>
-            <w:r>
-              <w:rPr>
-                <w:b w:val="false"/>
-                <w:bCs w:val="false"/>
-              </w:rPr>
-              <w:t xml:space="preserve">Pale crust</w:t>
-            </w:r>
-          </w:p>
-        </w:tc>
-        <w:tc>
-          <w:p>
-            <w:pPr>
-              <w:spacing w:after="40" w:before="40"/>
-              <w:jc w:val="left"/>
-            </w:pPr>
-            <w:r>
-              <w:rPr>
-                <w:b w:val="false"/>
-                <w:bCs w:val="false"/>
-              </w:rPr>
-              <w:t xml:space="preserve">Oven too cool or no steam</w:t>
-            </w:r>
-          </w:p>
-        </w:tc>
-        <w:tc>
-          <w:p>
-            <w:pPr>
-              <w:spacing w:after="40" w:before="40"/>
-              <w:jc w:val="left"/>
-            </w:pPr>
-            <w:r>
-              <w:rPr>
-                <w:b w:val="false"/>
-                <w:bCs w:val="false"/>
-              </w:rPr>
-              <w:t xml:space="preserve">Raise heat; bake covered</w:t>
-            </w:r>
-          </w:p>
-        </w:tc>
-      </w:tr>
-      <w:tr>
-        <w:trPr>
-          <w:tblHeader w:val="false"/>
-        </w:trPr>
-        <w:tc>
-          <w:p>
-            <w:pPr>
-              <w:spacing w:after="40" w:before="40"/>
-              <w:jc w:val="left"/>
-            </w:pPr>
-            <w:r>
-              <w:rPr>
-                <w:b w:val="false"/>
-                <w:bCs w:val="false"/>
-                <w:strike/>
-              </w:rPr>
-              <w:t xml:space="preserve">Burnt bottom</w:t>
-            </w:r>
-          </w:p>
-        </w:tc>
-        <w:tc>
-          <w:p>
-            <w:pPr>
-              <w:spacing w:after="40" w:before="40"/>
-              <w:jc w:val="left"/>
-            </w:pPr>
-            <w:r>
-              <w:rPr>
-                <w:b w:val="false"/>
-                <w:bCs w:val="false"/>
-              </w:rPr>
-              <w:t xml:space="preserve">Rack too low</w:t>
-            </w:r>
-          </w:p>
-        </w:tc>
-        <w:tc>
-          <w:p>
-            <w:pPr>
-              <w:spacing w:after="40" w:before="40"/>
-              <w:jc w:val="left"/>
-            </w:pPr>
-            <w:r>
-              <w:rPr>
-                <w:b w:val="false"/>
-                <w:bCs w:val="false"/>
-              </w:rPr>
               <w:t xml:space="preserve">Move the loaf up one level</w:t>
             </w:r>
           </w:p>
@@ -1843,7 +1975,7 @@
         <w:pStyle w:val="Heading2"/>
         <w:spacing w:after="120" w:before="240"/>
       </w:pPr>
-      <w:bookmarkStart w:name="_further_reading" w:id="1"/>
+      <w:bookmarkStart w:name="_appendix_flour_in_depth" w:id="1"/>
       <w:r>
         <w:rPr>
           <w:rFonts w:ascii="Calibri Light" w:cs="Calibri Light" w:eastAsia="Calibri Light" w:hAnsi="Calibri Light"/>
@@ -1853,6 +1985,126 @@
           <w:sz w:val="36"/>
           <w:szCs w:val="36"/>
         </w:rPr>
+        <w:t xml:space="preserve">Appendix: Flour, in Depth</w:t>
+      </w:r>
+      <w:bookmarkEnd w:id="1"/>
+    </w:p>
+    <w:p>
+      <w:r>
+        <w:t xml:space="preserve">Flour is deceptively complex, and a little vocabulary goes a long way when you are comparing bags at the store.</w:t>
+      </w:r>
+    </w:p>
+    <w:p>
+      <w:pPr>
+        <w:pStyle w:val="Heading3"/>
+        <w:spacing w:after="120" w:before="240"/>
+      </w:pPr>
+      <w:bookmarkStart w:name="_wheat_flours" w:id="1"/>
+      <w:r>
+        <w:rPr>
+          <w:rFonts w:ascii="Calibri Light" w:cs="Calibri Light" w:eastAsia="Calibri Light" w:hAnsi="Calibri Light"/>
+          <w:b w:val="false"/>
+          <w:bCs w:val="false"/>
+          <w:color w:val="2F5496"/>
+          <w:sz w:val="28"/>
+          <w:szCs w:val="28"/>
+        </w:rPr>
+        <w:t xml:space="preserve">Wheat Flours</w:t>
+      </w:r>
+      <w:bookmarkEnd w:id="1"/>
+    </w:p>
+    <w:p>
+      <w:r>
+        <w:t xml:space="preserve">The everyday flours most bakers reach for, sorted roughly by protein.</w:t>
+      </w:r>
+    </w:p>
+    <w:p>
+      <w:pPr>
+        <w:pStyle w:val="Heading4"/>
+        <w:spacing w:after="120" w:before="240"/>
+      </w:pPr>
+      <w:bookmarkStart w:name="_bread_flour" w:id="1"/>
+      <w:r>
+        <w:rPr>
+          <w:rFonts w:ascii="Calibri Light" w:cs="Calibri Light" w:eastAsia="Calibri Light" w:hAnsi="Calibri Light"/>
+          <w:b w:val="false"/>
+          <w:bCs w:val="false"/>
+          <w:color w:val="2F5496"/>
+          <w:sz w:val="24"/>
+          <w:szCs w:val="24"/>
+        </w:rPr>
+        <w:t xml:space="preserve">Bread Flour</w:t>
+      </w:r>
+      <w:bookmarkEnd w:id="1"/>
+    </w:p>
+    <w:p>
+      <w:r>
+        <w:t xml:space="preserve">High in protein and built for structure, chew, and a strong rise.</w:t>
+      </w:r>
+    </w:p>
+    <w:p>
+      <w:pPr>
+        <w:pStyle w:val="Heading5"/>
+        <w:spacing w:after="120" w:before="240"/>
+      </w:pPr>
+      <w:bookmarkStart w:name="_protein_range" w:id="1"/>
+      <w:r>
+        <w:rPr>
+          <w:rFonts w:ascii="Calibri Light" w:cs="Calibri Light" w:eastAsia="Calibri Light" w:hAnsi="Calibri Light"/>
+          <w:b w:val="false"/>
+          <w:bCs w:val="false"/>
+          <w:color w:val="2F5496"/>
+          <w:sz w:val="22"/>
+          <w:szCs w:val="22"/>
+        </w:rPr>
+        <w:t xml:space="preserve">Protein Range</w:t>
+      </w:r>
+      <w:bookmarkEnd w:id="1"/>
+    </w:p>
+    <w:p>
+      <w:r>
+        <w:t xml:space="preserve">Usually 12–14% protein — the extra gluten is what lets a lean dough hold its shape through a long ferment.</w:t>
+      </w:r>
+    </w:p>
+    <w:p>
+      <w:pPr>
+        <w:pStyle w:val="Heading6"/>
+        <w:spacing w:after="120" w:before="240"/>
+      </w:pPr>
+      <w:bookmarkStart w:name="_a_note_on_ash" w:id="1"/>
+      <w:r>
+        <w:rPr>
+          <w:rFonts w:ascii="Calibri Light" w:cs="Calibri Light" w:eastAsia="Calibri Light" w:hAnsi="Calibri Light"/>
+          <w:b w:val="false"/>
+          <w:bCs w:val="false"/>
+          <w:color w:val="2F5496"/>
+          <w:sz w:val="22"/>
+          <w:szCs w:val="22"/>
+        </w:rPr>
+        <w:t xml:space="preserve">A Note on Ash</w:t>
+      </w:r>
+      <w:bookmarkEnd w:id="1"/>
+    </w:p>
+    <w:p>
+      <w:r>
+        <w:t xml:space="preserve">“Ash” is the mineral content left after a flour sample is burned away. Higher-ash flours carry more of the bran and germ, so they ferment a little faster and taste closer to whole wheat.</w:t>
+      </w:r>
+    </w:p>
+    <w:p>
+      <w:pPr>
+        <w:pStyle w:val="Heading2"/>
+        <w:spacing w:after="120" w:before="240"/>
+      </w:pPr>
+      <w:bookmarkStart w:name="_further_reading" w:id="1"/>
+      <w:r>
+        <w:rPr>
+          <w:rFonts w:ascii="Calibri Light" w:cs="Calibri Light" w:eastAsia="Calibri Light" w:hAnsi="Calibri Light"/>
+          <w:b/>
+          <w:bCs/>
+          <w:color w:val="2F5496"/>
+          <w:sz w:val="36"/>
+          <w:szCs w:val="36"/>
+        </w:rPr>
         <w:t xml:space="preserve">Further Reading</w:t>
       </w:r>
       <w:bookmarkEnd w:id="1"/>
@@ -1873,7 +2125,7 @@
       <w:r>
         <w:t xml:space="preserve">The </w:t>
       </w:r>
-      <w:hyperlink w:history="1" r:id="rIduk-s07ir7nmu8skm_aj5v">
+      <w:hyperlink w:history="1" r:id="rIdy7srpnsa35v-j72sr8nvy">
         <w:r>
           <w:rPr>
             <w:color w:val="2563EB"/>
@@ -1897,17 +2149,32 @@
       <w:r>
         <w:t xml:space="preserve">King Arthur Baking's </w:t>
       </w:r>
-      <w:hyperlink w:history="1" r:id="rIdum2tnfj5cp8q8ydmauan1">
+      <w:r>
+        <w:t xml:space="preserve"> for how milling changes behavior.</w:t>
+      </w:r>
+    </w:p>
+    <w:p>
+      <w:pPr>
+        <w:pStyle w:val="ListParagraph"/>
+        <w:numPr>
+          <w:ilvl w:val="0"/>
+          <w:numId w:val="2"/>
+        </w:numPr>
+      </w:pPr>
+      <w:r>
+        <w:t xml:space="preserve">The Perfect Loaf keeps a deep sourdough archive at </w:t>
+      </w:r>
+      <w:hyperlink w:history="1" r:id="rIdgjs6wysz-zyjcskbhmapr">
         <w:r>
           <w:rPr>
             <w:color w:val="2563EB"/>
             <w:u w:val="single"/>
           </w:rPr>
-          <w:t xml:space="preserve">flour guide</w:t>
+          <w:t xml:space="preserve">https://www.theperfectloaf.com</w:t>
         </w:r>
       </w:hyperlink>
       <w:r>
-        <w:t xml:space="preserve"> for how milling changes behavior.</w:t>
+        <w:t xml:space="preserve">.</w:t>
       </w:r>
     </w:p>
     <w:p>
@@ -1975,6 +2242,14 @@
     </w:p>
     <w:p>
       <w:pPr>
+        <w:ind w:left="360"/>
+      </w:pPr>
+      <w:r>
+        <w:t xml:space="preserve">If you do not own a thermometer, tap the base of the loaf: a hollow, drum-like sound is the traditional sign that it is fully baked.</w:t>
+      </w:r>
+    </w:p>
+    <w:p>
+      <w:pPr>
         <w:pStyle w:val="ListParagraph"/>
         <w:numPr>
           <w:ilvl w:val="0"/>
@@ -2008,7 +2283,13 @@
         <w:t xml:space="preserve">md2x</w:t>
       </w:r>
       <w:r>
-        <w:t xml:space="preserve">. Bake often, weigh everything, and trust your dough over the clock.</w:t>
+        <w:t xml:space="preserve">.</w:t>
+      </w:r>
+      <w:r>
+        <w:br/>
+      </w:r>
+      <w:r>
+        <w:t xml:space="preserve">Bake often, weigh everything, and trust your dough over the clock.</w:t>
       </w:r>
     </w:p>
     <w:sectPr>

</xml_diff>

<commit_message>
feat: rich blockquotes and GitHub callouts in docx
</commit_message>
<xml_diff>
--- a/examples/sample.docx
+++ b/examples/sample.docx
@@ -548,33 +548,65 @@
         </w:drawing>
       </w:r>
     </w:p>
-    <w:p>
-      <w:pPr>
-        <w:pBdr>
-          <w:left w:val="single" w:color="6B7280" w:sz="18" w:space="12"/>
-        </w:pBdr>
-        <w:ind w:left="360"/>
-      </w:pPr>
-      <w:r>
-        <w:rPr>
-          <w:i/>
-          <w:iCs/>
-        </w:rPr>
-        <w:t xml:space="preserve">Good bread is mostly patience with a short list of ingredients. If a loaf disappoints, the fix is almost always </w:t>
-      </w:r>
-      <w:r>
-        <w:rPr>
-          <w:i/>
-          <w:iCs/>
-        </w:rPr>
-        <w:t xml:space="preserve">more time</w:t>
-      </w:r>
-      <w:r>
-        <w:rPr>
-          <w:i/>
-          <w:iCs/>
-        </w:rPr>
-        <w:t xml:space="preserve">, not more flour.</w:t>
+    <w:tbl>
+      <w:tblPr>
+        <w:tblW w:type="pct" w:w="100%"/>
+        <w:tblBorders>
+          <w:top w:val="none" w:color="auto" w:sz="0"/>
+          <w:left w:val="none" w:color="auto" w:sz="0"/>
+          <w:bottom w:val="none" w:color="auto" w:sz="0"/>
+          <w:right w:val="none" w:color="auto" w:sz="0"/>
+          <w:insideH w:val="none" w:color="auto" w:sz="0"/>
+          <w:insideV w:val="none" w:color="auto" w:sz="0"/>
+        </w:tblBorders>
+      </w:tblPr>
+      <w:tblGrid>
+        <w:gridCol w:w="100"/>
+      </w:tblGrid>
+      <w:tr>
+        <w:tc>
+          <w:tcPr>
+            <w:tcBorders>
+              <w:top w:val="none" w:color="auto" w:sz="0"/>
+              <w:left w:val="single" w:color="6B7280" w:sz="24"/>
+              <w:bottom w:val="none" w:color="auto" w:sz="0"/>
+              <w:right w:val="none" w:color="auto" w:sz="0"/>
+            </w:tcBorders>
+            <w:tcMar>
+              <w:top w:type="dxa" w:w="80"/>
+              <w:left w:type="dxa" w:w="220"/>
+              <w:bottom w:type="dxa" w:w="80"/>
+              <w:right w:type="dxa" w:w="160"/>
+            </w:tcMar>
+          </w:tcPr>
+          <w:p>
+            <w:r>
+              <w:t xml:space="preserve">Good bread is mostly patience with a short list of ingredients. If a loaf disappoints, the fix is almost always </w:t>
+            </w:r>
+            <w:r>
+              <w:rPr>
+                <w:i/>
+                <w:iCs/>
+              </w:rPr>
+              <w:t xml:space="preserve">more time</w:t>
+            </w:r>
+            <w:r>
+              <w:t xml:space="preserve">, not more flour.</w:t>
+            </w:r>
+          </w:p>
+        </w:tc>
+      </w:tr>
+    </w:tbl>
+    <w:p>
+      <w:pPr>
+        <w:spacing w:after="0" w:before="0"/>
+      </w:pPr>
+      <w:r>
+        <w:rPr>
+          <w:sz w:val="8"/>
+          <w:szCs w:val="8"/>
+        </w:rPr>
+        <w:t xml:space="preserve"/>
       </w:r>
     </w:p>
     <w:p>
@@ -601,6 +633,128 @@
         <w:t xml:space="preserve">You need less equipment than most recipes imply, but the ingredients deserve care. Weigh them if you can — volume measurements for flour can vary by a third.</w:t>
       </w:r>
     </w:p>
+    <w:tbl>
+      <w:tblPr>
+        <w:tblW w:type="pct" w:w="100%"/>
+        <w:tblBorders>
+          <w:top w:val="none" w:color="auto" w:sz="0"/>
+          <w:left w:val="none" w:color="auto" w:sz="0"/>
+          <w:bottom w:val="none" w:color="auto" w:sz="0"/>
+          <w:right w:val="none" w:color="auto" w:sz="0"/>
+          <w:insideH w:val="none" w:color="auto" w:sz="0"/>
+          <w:insideV w:val="none" w:color="auto" w:sz="0"/>
+        </w:tblBorders>
+      </w:tblPr>
+      <w:tblGrid>
+        <w:gridCol w:w="100"/>
+      </w:tblGrid>
+      <w:tr>
+        <w:tc>
+          <w:tcPr>
+            <w:tcBorders>
+              <w:top w:val="none" w:color="auto" w:sz="0"/>
+              <w:left w:val="single" w:color="8250DF" w:sz="24"/>
+              <w:bottom w:val="none" w:color="auto" w:sz="0"/>
+              <w:right w:val="none" w:color="auto" w:sz="0"/>
+            </w:tcBorders>
+            <w:shd w:fill="FBEFFF" w:color="auto" w:val="clear"/>
+            <w:tcMar>
+              <w:top w:type="dxa" w:w="80"/>
+              <w:left w:type="dxa" w:w="220"/>
+              <w:bottom w:type="dxa" w:w="80"/>
+              <w:right w:type="dxa" w:w="160"/>
+            </w:tcMar>
+          </w:tcPr>
+          <w:p>
+            <w:pPr>
+              <w:spacing w:after="80"/>
+            </w:pPr>
+            <w:r>
+              <w:rPr>
+                <w:b/>
+                <w:bCs/>
+                <w:color w:val="8250DF"/>
+              </w:rPr>
+              <w:t xml:space="preserve">❗ Important</w:t>
+            </w:r>
+          </w:p>
+          <w:p>
+            <w:r>
+              <w:t xml:space="preserve">Three variables dominate every loaf, in rough order of impact:</w:t>
+            </w:r>
+          </w:p>
+          <w:p>
+            <w:pPr>
+              <w:pStyle w:val="ListParagraph"/>
+              <w:numPr>
+                <w:ilvl w:val="0"/>
+                <w:numId w:val="2"/>
+              </w:numPr>
+            </w:pPr>
+            <w:r>
+              <w:rPr>
+                <w:b/>
+                <w:bCs/>
+              </w:rPr>
+              <w:t xml:space="preserve">Time</w:t>
+            </w:r>
+            <w:r>
+              <w:t xml:space="preserve"> — under-fermenting is by far the most common mistake.</w:t>
+            </w:r>
+          </w:p>
+          <w:p>
+            <w:pPr>
+              <w:pStyle w:val="ListParagraph"/>
+              <w:numPr>
+                <w:ilvl w:val="0"/>
+                <w:numId w:val="2"/>
+              </w:numPr>
+            </w:pPr>
+            <w:r>
+              <w:rPr>
+                <w:b/>
+                <w:bCs/>
+              </w:rPr>
+              <w:t xml:space="preserve">Temperature</w:t>
+            </w:r>
+            <w:r>
+              <w:t xml:space="preserve"> — of both the dough and the oven.</w:t>
+            </w:r>
+          </w:p>
+          <w:p>
+            <w:pPr>
+              <w:pStyle w:val="ListParagraph"/>
+              <w:numPr>
+                <w:ilvl w:val="0"/>
+                <w:numId w:val="2"/>
+              </w:numPr>
+            </w:pPr>
+            <w:r>
+              <w:rPr>
+                <w:b/>
+                <w:bCs/>
+              </w:rPr>
+              <w:t xml:space="preserve">Hydration</w:t>
+            </w:r>
+            <w:r>
+              <w:t xml:space="preserve"> — how much water the flour is carrying.</w:t>
+            </w:r>
+          </w:p>
+        </w:tc>
+      </w:tr>
+    </w:tbl>
+    <w:p>
+      <w:pPr>
+        <w:spacing w:after="0" w:before="0"/>
+      </w:pPr>
+      <w:r>
+        <w:rPr>
+          <w:sz w:val="8"/>
+          <w:szCs w:val="8"/>
+        </w:rPr>
+        <w:t xml:space="preserve"/>
+      </w:r>
+    </w:p>
     <w:p>
       <w:pPr>
         <w:pStyle w:val="Heading3"/>
@@ -625,7 +779,7 @@
         <w:pStyle w:val="ListParagraph"/>
         <w:numPr>
           <w:ilvl w:val="0"/>
-          <w:numId w:val="2"/>
+          <w:numId w:val="3"/>
         </w:numPr>
       </w:pPr>
       <w:r>
@@ -644,7 +798,7 @@
         <w:pStyle w:val="ListParagraph"/>
         <w:numPr>
           <w:ilvl w:val="1"/>
-          <w:numId w:val="2"/>
+          <w:numId w:val="3"/>
         </w:numPr>
       </w:pPr>
       <w:r>
@@ -656,7 +810,7 @@
         <w:pStyle w:val="ListParagraph"/>
         <w:numPr>
           <w:ilvl w:val="1"/>
-          <w:numId w:val="2"/>
+          <w:numId w:val="3"/>
         </w:numPr>
       </w:pPr>
       <w:r>
@@ -668,7 +822,7 @@
         <w:pStyle w:val="ListParagraph"/>
         <w:numPr>
           <w:ilvl w:val="0"/>
-          <w:numId w:val="2"/>
+          <w:numId w:val="3"/>
         </w:numPr>
       </w:pPr>
       <w:r>
@@ -687,7 +841,7 @@
         <w:pStyle w:val="ListParagraph"/>
         <w:numPr>
           <w:ilvl w:val="0"/>
-          <w:numId w:val="2"/>
+          <w:numId w:val="3"/>
         </w:numPr>
       </w:pPr>
       <w:r>
@@ -706,7 +860,7 @@
         <w:pStyle w:val="ListParagraph"/>
         <w:numPr>
           <w:ilvl w:val="0"/>
-          <w:numId w:val="2"/>
+          <w:numId w:val="3"/>
         </w:numPr>
       </w:pPr>
       <w:r>
@@ -753,7 +907,7 @@
         <w:pStyle w:val="ListParagraph"/>
         <w:numPr>
           <w:ilvl w:val="0"/>
-          <w:numId w:val="2"/>
+          <w:numId w:val="3"/>
         </w:numPr>
       </w:pPr>
       <w:r>
@@ -768,7 +922,7 @@
         <w:pStyle w:val="ListParagraph"/>
         <w:numPr>
           <w:ilvl w:val="0"/>
-          <w:numId w:val="2"/>
+          <w:numId w:val="3"/>
         </w:numPr>
       </w:pPr>
       <w:r>
@@ -783,7 +937,7 @@
         <w:pStyle w:val="ListParagraph"/>
         <w:numPr>
           <w:ilvl w:val="0"/>
-          <w:numId w:val="2"/>
+          <w:numId w:val="3"/>
         </w:numPr>
       </w:pPr>
       <w:r>
@@ -798,7 +952,7 @@
         <w:pStyle w:val="ListParagraph"/>
         <w:numPr>
           <w:ilvl w:val="0"/>
-          <w:numId w:val="2"/>
+          <w:numId w:val="3"/>
         </w:numPr>
       </w:pPr>
       <w:r>
@@ -813,7 +967,7 @@
         <w:pStyle w:val="ListParagraph"/>
         <w:numPr>
           <w:ilvl w:val="0"/>
-          <w:numId w:val="2"/>
+          <w:numId w:val="3"/>
         </w:numPr>
       </w:pPr>
       <w:r>
@@ -859,12 +1013,125 @@
         <w:t xml:space="preserve"> covers the usual suspects.</w:t>
       </w:r>
     </w:p>
+    <w:tbl>
+      <w:tblPr>
+        <w:tblW w:type="pct" w:w="100%"/>
+        <w:tblBorders>
+          <w:top w:val="none" w:color="auto" w:sz="0"/>
+          <w:left w:val="none" w:color="auto" w:sz="0"/>
+          <w:bottom w:val="none" w:color="auto" w:sz="0"/>
+          <w:right w:val="none" w:color="auto" w:sz="0"/>
+          <w:insideH w:val="none" w:color="auto" w:sz="0"/>
+          <w:insideV w:val="none" w:color="auto" w:sz="0"/>
+        </w:tblBorders>
+      </w:tblPr>
+      <w:tblGrid>
+        <w:gridCol w:w="100"/>
+      </w:tblGrid>
+      <w:tr>
+        <w:tc>
+          <w:tcPr>
+            <w:tcBorders>
+              <w:top w:val="none" w:color="auto" w:sz="0"/>
+              <w:left w:val="single" w:color="6B7280" w:sz="24"/>
+              <w:bottom w:val="none" w:color="auto" w:sz="0"/>
+              <w:right w:val="none" w:color="auto" w:sz="0"/>
+            </w:tcBorders>
+            <w:tcMar>
+              <w:top w:type="dxa" w:w="80"/>
+              <w:left w:type="dxa" w:w="220"/>
+              <w:bottom w:type="dxa" w:w="80"/>
+              <w:right w:type="dxa" w:w="160"/>
+            </w:tcMar>
+          </w:tcPr>
+          <w:p>
+            <w:r>
+              <w:t xml:space="preserve">At heart, the method is just three rests with a little work between them:</w:t>
+            </w:r>
+          </w:p>
+          <w:p>
+            <w:pPr>
+              <w:pStyle w:val="ListParagraph"/>
+              <w:numPr>
+                <w:ilvl w:val="0"/>
+                <w:numId w:val="4"/>
+              </w:numPr>
+            </w:pPr>
+            <w:r>
+              <w:rPr>
+                <w:b/>
+                <w:bCs/>
+              </w:rPr>
+              <w:t xml:space="preserve">Autolyse</w:t>
+            </w:r>
+            <w:r>
+              <w:t xml:space="preserve"> — flour and water get acquainted.</w:t>
+            </w:r>
+          </w:p>
+          <w:p>
+            <w:pPr>
+              <w:pStyle w:val="ListParagraph"/>
+              <w:numPr>
+                <w:ilvl w:val="0"/>
+                <w:numId w:val="4"/>
+              </w:numPr>
+            </w:pPr>
+            <w:r>
+              <w:rPr>
+                <w:b/>
+                <w:bCs/>
+              </w:rPr>
+              <w:t xml:space="preserve">Bulk ferment</w:t>
+            </w:r>
+            <w:r>
+              <w:t xml:space="preserve"> — the dough comes alive.</w:t>
+            </w:r>
+          </w:p>
+          <w:p>
+            <w:pPr>
+              <w:pStyle w:val="ListParagraph"/>
+              <w:numPr>
+                <w:ilvl w:val="0"/>
+                <w:numId w:val="4"/>
+              </w:numPr>
+            </w:pPr>
+            <w:r>
+              <w:rPr>
+                <w:b/>
+                <w:bCs/>
+              </w:rPr>
+              <w:t xml:space="preserve">Final proof</w:t>
+            </w:r>
+            <w:r>
+              <w:t xml:space="preserve"> — the shaped loaf relaxes before baking.</w:t>
+            </w:r>
+          </w:p>
+          <w:p>
+            <w:r>
+              <w:t xml:space="preserve">Everything below is detail layered on those three rests.</w:t>
+            </w:r>
+          </w:p>
+        </w:tc>
+      </w:tr>
+    </w:tbl>
+    <w:p>
+      <w:pPr>
+        <w:spacing w:after="0" w:before="0"/>
+      </w:pPr>
+      <w:r>
+        <w:rPr>
+          <w:sz w:val="8"/>
+          <w:szCs w:val="8"/>
+        </w:rPr>
+        <w:t xml:space="preserve"/>
+      </w:r>
+    </w:p>
     <w:p>
       <w:pPr>
         <w:pStyle w:val="ListParagraph"/>
         <w:numPr>
           <w:ilvl w:val="0"/>
-          <w:numId w:val="3"/>
+          <w:numId w:val="5"/>
         </w:numPr>
       </w:pPr>
       <w:r>
@@ -876,68 +1143,6 @@
       </w:r>
       <w:r>
         <w:t xml:space="preserve"> Combine the flour and most of the water and let it rest, covered, for 30–60 minutes. This head start lets the flour hydrate fully before any kneading.</w:t>
-      </w:r>
-    </w:p>
-    <w:p>
-      <w:pPr>
-        <w:pStyle w:val="ListParagraph"/>
-        <w:numPr>
-          <w:ilvl w:val="1"/>
-          <w:numId w:val="2"/>
-        </w:numPr>
-      </w:pPr>
-      <w:r>
-        <w:t xml:space="preserve">No salt or leaven yet; they can wait.</w:t>
-      </w:r>
-    </w:p>
-    <w:p>
-      <w:pPr>
-        <w:pStyle w:val="ListParagraph"/>
-        <w:numPr>
-          <w:ilvl w:val="1"/>
-          <w:numId w:val="2"/>
-        </w:numPr>
-      </w:pPr>
-      <w:r>
-        <w:t xml:space="preserve">The dough will look shaggy and rough — that is expected.</w:t>
-      </w:r>
-    </w:p>
-    <w:p>
-      <w:pPr>
-        <w:pStyle w:val="ListParagraph"/>
-        <w:numPr>
-          <w:ilvl w:val="0"/>
-          <w:numId w:val="3"/>
-        </w:numPr>
-      </w:pPr>
-      <w:r>
-        <w:rPr>
-          <w:b/>
-          <w:bCs/>
-        </w:rPr>
-        <w:t xml:space="preserve">Mix.</w:t>
-      </w:r>
-      <w:r>
-        <w:t xml:space="preserve"> Add the leaven and salt with the reserved water and squeeze until the dough is uniform.</w:t>
-      </w:r>
-    </w:p>
-    <w:p>
-      <w:pPr>
-        <w:pStyle w:val="ListParagraph"/>
-        <w:numPr>
-          <w:ilvl w:val="0"/>
-          <w:numId w:val="3"/>
-        </w:numPr>
-      </w:pPr>
-      <w:r>
-        <w:rPr>
-          <w:b/>
-          <w:bCs/>
-        </w:rPr>
-        <w:t xml:space="preserve">Bulk ferment.</w:t>
-      </w:r>
-      <w:r>
-        <w:t xml:space="preserve"> Over the next few hours, give the dough a series of gentle folds:</w:t>
       </w:r>
     </w:p>
     <w:p>
@@ -949,7 +1154,7 @@
         </w:numPr>
       </w:pPr>
       <w:r>
-        <w:t xml:space="preserve">Fold every 30 minutes for the first two hours.</w:t>
+        <w:t xml:space="preserve">No salt or leaven yet; they can wait.</w:t>
       </w:r>
     </w:p>
     <w:p>
@@ -961,7 +1166,7 @@
         </w:numPr>
       </w:pPr>
       <w:r>
-        <w:t xml:space="preserve">Then let it rest undisturbed until it has grown by about half.</w:t>
+        <w:t xml:space="preserve">The dough will look shaggy and rough — that is expected.</w:t>
       </w:r>
     </w:p>
     <w:p>
@@ -969,7 +1174,7 @@
         <w:pStyle w:val="ListParagraph"/>
         <w:numPr>
           <w:ilvl w:val="0"/>
-          <w:numId w:val="3"/>
+          <w:numId w:val="5"/>
         </w:numPr>
       </w:pPr>
       <w:r>
@@ -977,10 +1182,10 @@
           <w:b/>
           <w:bCs/>
         </w:rPr>
-        <w:t xml:space="preserve">Shape.</w:t>
-      </w:r>
-      <w:r>
-        <w:t xml:space="preserve"> Turn the dough out, shape it into a taut round, and settle it into a floured banneton.</w:t>
+        <w:t xml:space="preserve">Mix.</w:t>
+      </w:r>
+      <w:r>
+        <w:t xml:space="preserve"> Add the leaven and salt with the reserved water and squeeze until the dough is uniform.</w:t>
       </w:r>
     </w:p>
     <w:p>
@@ -988,7 +1193,7 @@
         <w:pStyle w:val="ListParagraph"/>
         <w:numPr>
           <w:ilvl w:val="0"/>
-          <w:numId w:val="3"/>
+          <w:numId w:val="5"/>
         </w:numPr>
       </w:pPr>
       <w:r>
@@ -996,25 +1201,137 @@
           <w:b/>
           <w:bCs/>
         </w:rPr>
+        <w:t xml:space="preserve">Bulk ferment.</w:t>
+      </w:r>
+      <w:r>
+        <w:t xml:space="preserve"> Over the next few hours, give the dough a series of gentle folds:</w:t>
+      </w:r>
+    </w:p>
+    <w:p>
+      <w:pPr>
+        <w:pStyle w:val="ListParagraph"/>
+        <w:numPr>
+          <w:ilvl w:val="1"/>
+          <w:numId w:val="5"/>
+        </w:numPr>
+      </w:pPr>
+      <w:r>
+        <w:t xml:space="preserve">Fold every 30 minutes for the first two hours.</w:t>
+      </w:r>
+    </w:p>
+    <w:p>
+      <w:pPr>
+        <w:pStyle w:val="ListParagraph"/>
+        <w:numPr>
+          <w:ilvl w:val="1"/>
+          <w:numId w:val="5"/>
+        </w:numPr>
+      </w:pPr>
+      <w:r>
+        <w:t xml:space="preserve">Then let it rest undisturbed until it has grown by about half.</w:t>
+      </w:r>
+    </w:p>
+    <w:p>
+      <w:pPr>
+        <w:pStyle w:val="ListParagraph"/>
+        <w:numPr>
+          <w:ilvl w:val="0"/>
+          <w:numId w:val="5"/>
+        </w:numPr>
+      </w:pPr>
+      <w:r>
+        <w:rPr>
+          <w:b/>
+          <w:bCs/>
+        </w:rPr>
+        <w:t xml:space="preserve">Shape.</w:t>
+      </w:r>
+      <w:r>
+        <w:t xml:space="preserve"> Turn the dough out, shape it into a taut round, and settle it into a floured banneton.</w:t>
+      </w:r>
+    </w:p>
+    <w:p>
+      <w:pPr>
+        <w:pStyle w:val="ListParagraph"/>
+        <w:numPr>
+          <w:ilvl w:val="0"/>
+          <w:numId w:val="5"/>
+        </w:numPr>
+      </w:pPr>
+      <w:r>
+        <w:rPr>
+          <w:b/>
+          <w:bCs/>
+        </w:rPr>
         <w:t xml:space="preserve">Proof and bake.</w:t>
       </w:r>
       <w:r>
         <w:t xml:space="preserve"> Chill overnight, then bake covered at 245 °C for 20 minutes and uncovered for another 20–25 until deeply browned.</w:t>
       </w:r>
     </w:p>
-    <w:p>
-      <w:pPr>
-        <w:pBdr>
-          <w:left w:val="single" w:color="6B7280" w:sz="18" w:space="12"/>
-        </w:pBdr>
-        <w:ind w:left="360"/>
-      </w:pPr>
-      <w:r>
-        <w:rPr>
-          <w:i/>
-          <w:iCs/>
-        </w:rPr>
-        <w:t xml:space="preserve">Tip: a cold overnight proof is optional but forgiving — it spreads the schedule across two days and deepens the flavor.</w:t>
+    <w:tbl>
+      <w:tblPr>
+        <w:tblW w:type="pct" w:w="100%"/>
+        <w:tblBorders>
+          <w:top w:val="none" w:color="auto" w:sz="0"/>
+          <w:left w:val="none" w:color="auto" w:sz="0"/>
+          <w:bottom w:val="none" w:color="auto" w:sz="0"/>
+          <w:right w:val="none" w:color="auto" w:sz="0"/>
+          <w:insideH w:val="none" w:color="auto" w:sz="0"/>
+          <w:insideV w:val="none" w:color="auto" w:sz="0"/>
+        </w:tblBorders>
+      </w:tblPr>
+      <w:tblGrid>
+        <w:gridCol w:w="100"/>
+      </w:tblGrid>
+      <w:tr>
+        <w:tc>
+          <w:tcPr>
+            <w:tcBorders>
+              <w:top w:val="none" w:color="auto" w:sz="0"/>
+              <w:left w:val="single" w:color="1A7F37" w:sz="24"/>
+              <w:bottom w:val="none" w:color="auto" w:sz="0"/>
+              <w:right w:val="none" w:color="auto" w:sz="0"/>
+            </w:tcBorders>
+            <w:shd w:fill="DAFBE1" w:color="auto" w:val="clear"/>
+            <w:tcMar>
+              <w:top w:type="dxa" w:w="80"/>
+              <w:left w:type="dxa" w:w="220"/>
+              <w:bottom w:type="dxa" w:w="80"/>
+              <w:right w:type="dxa" w:w="160"/>
+            </w:tcMar>
+          </w:tcPr>
+          <w:p>
+            <w:pPr>
+              <w:spacing w:after="80"/>
+            </w:pPr>
+            <w:r>
+              <w:rPr>
+                <w:b/>
+                <w:bCs/>
+                <w:color w:val="1A7F37"/>
+              </w:rPr>
+              <w:t xml:space="preserve">💡 Tip</w:t>
+            </w:r>
+          </w:p>
+          <w:p>
+            <w:r>
+              <w:t xml:space="preserve">A cold overnight proof is optional but forgiving — it spreads the schedule across two days and deepens the flavor.</w:t>
+            </w:r>
+          </w:p>
+        </w:tc>
+      </w:tr>
+    </w:tbl>
+    <w:p>
+      <w:pPr>
+        <w:spacing w:after="0" w:before="0"/>
+      </w:pPr>
+      <w:r>
+        <w:rPr>
+          <w:sz w:val="8"/>
+          <w:szCs w:val="8"/>
+        </w:rPr>
+        <w:t xml:space="preserve"/>
       </w:r>
     </w:p>
     <w:p>
@@ -1090,6 +1407,71 @@
         </w:drawing>
       </w:r>
     </w:p>
+    <w:tbl>
+      <w:tblPr>
+        <w:tblW w:type="pct" w:w="100%"/>
+        <w:tblBorders>
+          <w:top w:val="none" w:color="auto" w:sz="0"/>
+          <w:left w:val="none" w:color="auto" w:sz="0"/>
+          <w:bottom w:val="none" w:color="auto" w:sz="0"/>
+          <w:right w:val="none" w:color="auto" w:sz="0"/>
+          <w:insideH w:val="none" w:color="auto" w:sz="0"/>
+          <w:insideV w:val="none" w:color="auto" w:sz="0"/>
+        </w:tblBorders>
+      </w:tblPr>
+      <w:tblGrid>
+        <w:gridCol w:w="100"/>
+      </w:tblGrid>
+      <w:tr>
+        <w:tc>
+          <w:tcPr>
+            <w:tcBorders>
+              <w:top w:val="none" w:color="auto" w:sz="0"/>
+              <w:left w:val="single" w:color="9A6700" w:sz="24"/>
+              <w:bottom w:val="none" w:color="auto" w:sz="0"/>
+              <w:right w:val="none" w:color="auto" w:sz="0"/>
+            </w:tcBorders>
+            <w:shd w:fill="FFF8C5" w:color="auto" w:val="clear"/>
+            <w:tcMar>
+              <w:top w:type="dxa" w:w="80"/>
+              <w:left w:type="dxa" w:w="220"/>
+              <w:bottom w:type="dxa" w:w="80"/>
+              <w:right w:type="dxa" w:w="160"/>
+            </w:tcMar>
+          </w:tcPr>
+          <w:p>
+            <w:pPr>
+              <w:spacing w:after="80"/>
+            </w:pPr>
+            <w:r>
+              <w:rPr>
+                <w:b/>
+                <w:bCs/>
+                <w:color w:val="9A6700"/>
+              </w:rPr>
+              <w:t xml:space="preserve">⚠️ Warning</w:t>
+            </w:r>
+          </w:p>
+          <w:p>
+            <w:r>
+              <w:t xml:space="preserve">A Dutch oven at 245 °C stays dangerously hot long after it leaves the oven. Use dry mitts, keep children clear, and never bring a damp cloth near the lid — trapped steam scalds instantly.</w:t>
+            </w:r>
+          </w:p>
+        </w:tc>
+      </w:tr>
+    </w:tbl>
+    <w:p>
+      <w:pPr>
+        <w:spacing w:after="0" w:before="0"/>
+      </w:pPr>
+      <w:r>
+        <w:rPr>
+          <w:sz w:val="8"/>
+          <w:szCs w:val="8"/>
+        </w:rPr>
+        <w:t xml:space="preserve"/>
+      </w:r>
+    </w:p>
     <w:p>
       <w:pPr>
         <w:pStyle w:val="Heading2"/>
@@ -2119,13 +2501,13 @@
         <w:pStyle w:val="ListParagraph"/>
         <w:numPr>
           <w:ilvl w:val="0"/>
-          <w:numId w:val="2"/>
+          <w:numId w:val="3"/>
         </w:numPr>
       </w:pPr>
       <w:r>
         <w:t xml:space="preserve">The </w:t>
       </w:r>
-      <w:hyperlink w:history="1" r:id="rIdy7srpnsa35v-j72sr8nvy">
+      <w:hyperlink w:history="1" r:id="rIdel6ug1v-oaifo205u8biv">
         <w:r>
           <w:rPr>
             <w:color w:val="2563EB"/>
@@ -2143,7 +2525,7 @@
         <w:pStyle w:val="ListParagraph"/>
         <w:numPr>
           <w:ilvl w:val="0"/>
-          <w:numId w:val="2"/>
+          <w:numId w:val="3"/>
         </w:numPr>
       </w:pPr>
       <w:r>
@@ -2158,13 +2540,13 @@
         <w:pStyle w:val="ListParagraph"/>
         <w:numPr>
           <w:ilvl w:val="0"/>
-          <w:numId w:val="2"/>
+          <w:numId w:val="3"/>
         </w:numPr>
       </w:pPr>
       <w:r>
         <w:t xml:space="preserve">The Perfect Loaf keeps a deep sourdough archive at </w:t>
       </w:r>
-      <w:hyperlink w:history="1" r:id="rIdgjs6wysz-zyjcskbhmapr">
+      <w:hyperlink w:history="1" r:id="rIdccpumdcwh03qujqf4yoqk">
         <w:r>
           <w:rPr>
             <w:color w:val="2563EB"/>
@@ -2182,7 +2564,7 @@
         <w:pStyle w:val="ListParagraph"/>
         <w:numPr>
           <w:ilvl w:val="0"/>
-          <w:numId w:val="2"/>
+          <w:numId w:val="3"/>
         </w:numPr>
       </w:pPr>
       <w:r>
@@ -2231,7 +2613,7 @@
         <w:pStyle w:val="ListParagraph"/>
         <w:numPr>
           <w:ilvl w:val="0"/>
-          <w:numId w:val="4"/>
+          <w:numId w:val="6"/>
         </w:numPr>
       </w:pPr>
       <w:bookmarkStart w:name="_md2x_note_1" w:id="1"/>
@@ -2253,7 +2635,7 @@
         <w:pStyle w:val="ListParagraph"/>
         <w:numPr>
           <w:ilvl w:val="0"/>
-          <w:numId w:val="4"/>
+          <w:numId w:val="6"/>
         </w:numPr>
       </w:pPr>
       <w:bookmarkStart w:name="_md2x_note_2" w:id="1"/>
@@ -2470,6 +2852,45 @@
     <w:multiLevelType w:val="hybridMultilevel"/>
     <w:lvl w:ilvl="0" w15:tentative="1">
       <w:start w:val="1"/>
+      <w:numFmt w:val="decimal"/>
+      <w:lvlText w:val="%1."/>
+      <w:lvlJc w:val="start"/>
+      <w:pPr>
+        <w:ind w:left="360" w:hanging="260"/>
+      </w:pPr>
+    </w:lvl>
+    <w:lvl w:ilvl="1" w15:tentative="1">
+      <w:start w:val="1"/>
+      <w:numFmt w:val="decimal"/>
+      <w:lvlText w:val="%2."/>
+      <w:lvlJc w:val="start"/>
+      <w:pPr>
+        <w:ind w:left="720" w:hanging="260"/>
+      </w:pPr>
+    </w:lvl>
+    <w:lvl w:ilvl="2" w15:tentative="1">
+      <w:start w:val="1"/>
+      <w:numFmt w:val="decimal"/>
+      <w:lvlText w:val="%3."/>
+      <w:lvlJc w:val="start"/>
+      <w:pPr>
+        <w:ind w:left="1080" w:hanging="260"/>
+      </w:pPr>
+    </w:lvl>
+    <w:lvl w:ilvl="3" w15:tentative="1">
+      <w:start w:val="1"/>
+      <w:numFmt w:val="decimal"/>
+      <w:lvlText w:val="%4."/>
+      <w:lvlJc w:val="start"/>
+      <w:pPr>
+        <w:ind w:left="1440" w:hanging="260"/>
+      </w:pPr>
+    </w:lvl>
+  </w:abstractNum>
+  <w:abstractNum w:abstractNumId="3" w15:restartNumberingAfterBreak="0">
+    <w:multiLevelType w:val="hybridMultilevel"/>
+    <w:lvl w:ilvl="0" w15:tentative="1">
+      <w:start w:val="1"/>
       <w:numFmt w:val="bullet"/>
       <w:lvlText w:val="•"/>
       <w:lvlJc w:val="start"/>
@@ -2505,7 +2926,7 @@
       </w:pPr>
     </w:lvl>
   </w:abstractNum>
-  <w:abstractNum w:abstractNumId="3" w15:restartNumberingAfterBreak="0">
+  <w:abstractNum w:abstractNumId="4" w15:restartNumberingAfterBreak="0">
     <w:multiLevelType w:val="hybridMultilevel"/>
     <w:lvl w:ilvl="0" w15:tentative="1">
       <w:start w:val="1"/>
@@ -2544,7 +2965,46 @@
       </w:pPr>
     </w:lvl>
   </w:abstractNum>
-  <w:abstractNum w:abstractNumId="4" w15:restartNumberingAfterBreak="0">
+  <w:abstractNum w:abstractNumId="5" w15:restartNumberingAfterBreak="0">
+    <w:multiLevelType w:val="hybridMultilevel"/>
+    <w:lvl w:ilvl="0" w15:tentative="1">
+      <w:start w:val="1"/>
+      <w:numFmt w:val="decimal"/>
+      <w:lvlText w:val="%1."/>
+      <w:lvlJc w:val="start"/>
+      <w:pPr>
+        <w:ind w:left="360" w:hanging="260"/>
+      </w:pPr>
+    </w:lvl>
+    <w:lvl w:ilvl="1" w15:tentative="1">
+      <w:start w:val="1"/>
+      <w:numFmt w:val="decimal"/>
+      <w:lvlText w:val="%2."/>
+      <w:lvlJc w:val="start"/>
+      <w:pPr>
+        <w:ind w:left="720" w:hanging="260"/>
+      </w:pPr>
+    </w:lvl>
+    <w:lvl w:ilvl="2" w15:tentative="1">
+      <w:start w:val="1"/>
+      <w:numFmt w:val="decimal"/>
+      <w:lvlText w:val="%3."/>
+      <w:lvlJc w:val="start"/>
+      <w:pPr>
+        <w:ind w:left="1080" w:hanging="260"/>
+      </w:pPr>
+    </w:lvl>
+    <w:lvl w:ilvl="3" w15:tentative="1">
+      <w:start w:val="1"/>
+      <w:numFmt w:val="decimal"/>
+      <w:lvlText w:val="%4."/>
+      <w:lvlJc w:val="start"/>
+      <w:pPr>
+        <w:ind w:left="1440" w:hanging="260"/>
+      </w:pPr>
+    </w:lvl>
+  </w:abstractNum>
+  <w:abstractNum w:abstractNumId="6" w15:restartNumberingAfterBreak="0">
     <w:multiLevelType w:val="hybridMultilevel"/>
     <w:lvl w:ilvl="0" w15:tentative="1">
       <w:start w:val="1"/>
@@ -2603,6 +3063,18 @@
   </w:num>
   <w:num w:numId="4">
     <w:abstractNumId w:val="4"/>
+    <w:lvlOverride w:ilvl="0">
+      <w:startOverride w:val="1"/>
+    </w:lvlOverride>
+  </w:num>
+  <w:num w:numId="5">
+    <w:abstractNumId w:val="5"/>
+    <w:lvlOverride w:ilvl="0">
+      <w:startOverride w:val="1"/>
+    </w:lvlOverride>
+  </w:num>
+  <w:num w:numId="6">
+    <w:abstractNumId w:val="6"/>
     <w:lvlOverride w:ilvl="0">
       <w:startOverride w:val="1"/>
     </w:lvlOverride>

</xml_diff>